<commit_message>
Update notatki - dodanie elementu Menedżer Zasobów (Asset Manager)
</commit_message>
<xml_diff>
--- a/Doc/Elementy do silnika 3D.docx
+++ b/Doc/Elementy do silnika 3D.docx
@@ -1,9 +1,18 @@
 
 <file path=word/document.xml><?xml version="1.0" encoding="utf-8"?>
-<w:document xmlns:wpc="http://schemas.microsoft.com/office/word/2010/wordprocessingCanvas" xmlns:cx="http://schemas.microsoft.com/office/drawing/2014/chartex" xmlns:cx1="http://schemas.microsoft.com/office/drawing/2015/9/8/chartex" xmlns:cx2="http://schemas.microsoft.com/office/drawing/2015/10/21/chartex" xmlns:cx3="http://schemas.microsoft.com/office/drawing/2016/5/9/chartex" xmlns:cx4="http://schemas.microsoft.com/office/drawing/2016/5/10/chartex" xmlns:cx5="http://schemas.microsoft.com/office/drawing/2016/5/11/chartex" xmlns:cx6="http://schemas.microsoft.com/office/drawing/2016/5/12/chartex" xmlns:cx7="http://schemas.microsoft.com/office/drawing/2016/5/13/chartex" xmlns:cx8="http://schemas.microsoft.com/office/drawing/2016/5/14/chartex" xmlns:mc="http://schemas.openxmlformats.org/markup-compatibility/2006" xmlns:aink="http://schemas.microsoft.com/office/drawing/2016/ink" xmlns:am3d="http://schemas.microsoft.com/office/drawing/2017/model3d" xmlns:o="urn:schemas-microsoft-com:office:office" xmlns:oel="http://schemas.microsoft.com/office/2019/extlst" xmlns:r="http://schemas.openxmlformats.org/officeDocument/2006/relationships" xmlns:m="http://schemas.openxmlformats.org/officeDocument/2006/math" xmlns:v="urn:schemas-microsoft-com:vml" xmlns:wp14="http://schemas.microsoft.com/office/word/2010/wordprocessingDrawing" xmlns:wp="http://schemas.openxmlformats.org/drawingml/2006/wordprocessingDrawing" xmlns:w10="urn:schemas-microsoft-com:office:word" xmlns:w="http://schemas.openxmlformats.org/wordprocessingml/2006/main" xmlns:w14="http://schemas.microsoft.com/office/word/2010/wordml" xmlns:w15="http://schemas.microsoft.com/office/word/2012/wordml" xmlns:w16cex="http://schemas.microsoft.com/office/word/2018/wordml/cex" xmlns:w16cid="http://schemas.microsoft.com/office/word/2016/wordml/cid" xmlns:w16="http://schemas.microsoft.com/office/word/2018/wordml" xmlns:w16du="http://schemas.microsoft.com/office/word/2023/wordml/word16du" xmlns:w16sdtdh="http://schemas.microsoft.com/office/word/2020/wordml/sdtdatahash" xmlns:w16sdtfl="http://schemas.microsoft.com/office/word/2024/wordml/sdtformatlock" xmlns:w16se="http://schemas.microsoft.com/office/word/2015/wordml/symex" xmlns:wpg="http://schemas.microsoft.com/office/word/2010/wordprocessingGroup" xmlns:wpi="http://schemas.microsoft.com/office/word/2010/wordprocessingInk" xmlns:wne="http://schemas.microsoft.com/office/word/2006/wordml" xmlns:wps="http://schemas.microsoft.com/office/word/2010/wordprocessingShape" mc:Ignorable="w14 w15 w16se w16cid w16 w16cex w16sdtdh w16sdtfl w16du wp14">
+<w:document xmlns:wpc="http://schemas.microsoft.com/office/word/2010/wordprocessingCanvas" xmlns:cx="http://schemas.microsoft.com/office/drawing/2014/chartex" xmlns:cx1="http://schemas.microsoft.com/office/drawing/2015/9/8/chartex" xmlns:cx2="http://schemas.microsoft.com/office/drawing/2015/10/21/chartex" xmlns:cx3="http://schemas.microsoft.com/office/drawing/2016/5/9/chartex" xmlns:cx4="http://schemas.microsoft.com/office/drawing/2016/5/10/chartex" xmlns:cx5="http://schemas.microsoft.com/office/drawing/2016/5/11/chartex" xmlns:cx6="http://schemas.microsoft.com/office/drawing/2016/5/12/chartex" xmlns:cx7="http://schemas.microsoft.com/office/drawing/2016/5/13/chartex" xmlns:cx8="http://schemas.microsoft.com/office/drawing/2016/5/14/chartex" xmlns:mc="http://schemas.openxmlformats.org/markup-compatibility/2006" xmlns:aink="http://schemas.microsoft.com/office/drawing/2016/ink" xmlns:am3d="http://schemas.microsoft.com/office/drawing/2017/model3d" xmlns:o="urn:schemas-microsoft-com:office:office" xmlns:oel="http://schemas.microsoft.com/office/2019/extlst" xmlns:r="http://schemas.openxmlformats.org/officeDocument/2006/relationships" xmlns:m="http://schemas.openxmlformats.org/officeDocument/2006/math" xmlns:v="urn:schemas-microsoft-com:vml" xmlns:wp14="http://schemas.microsoft.com/office/word/2010/wordprocessingDrawing" xmlns:wp="http://schemas.openxmlformats.org/drawingml/2006/wordprocessingDrawing" xmlns:w10="urn:schemas-microsoft-com:office:word" xmlns:w="http://schemas.openxmlformats.org/wordprocessingml/2006/main" xmlns:w14="http://schemas.microsoft.com/office/word/2010/wordml" xmlns:w15="http://schemas.microsoft.com/office/word/2012/wordml" xmlns:w16cei="http://schemas.microsoft.com/office/word/2026/wordml/cei" xmlns:w16cex="http://schemas.microsoft.com/office/word/2018/wordml/cex" xmlns:w16cid="http://schemas.microsoft.com/office/word/2016/wordml/cid" xmlns:w16="http://schemas.microsoft.com/office/word/2018/wordml" xmlns:w16du="http://schemas.microsoft.com/office/word/2023/wordml/word16du" xmlns:w16sdtdh="http://schemas.microsoft.com/office/word/2020/wordml/sdtdatahash" xmlns:w16sdtfl="http://schemas.microsoft.com/office/word/2024/wordml/sdtformatlock" xmlns:w16se="http://schemas.microsoft.com/office/word/2015/wordml/symex" xmlns:wpg="http://schemas.microsoft.com/office/word/2010/wordprocessingGroup" xmlns:wpi="http://schemas.microsoft.com/office/word/2010/wordprocessingInk" xmlns:wne="http://schemas.microsoft.com/office/word/2006/wordml" xmlns:wps="http://schemas.microsoft.com/office/word/2010/wordprocessingShape" mc:Ignorable="w14 w15 w16se w16cid w16 w16cex w16sdtdh w16sdtfl w16du wp14">
   <w:body>
     <w:sdt>
       <w:sdtPr>
+        <w:rPr>
+          <w:rFonts w:asciiTheme="minorHAnsi" w:eastAsiaTheme="minorHAnsi" w:hAnsiTheme="minorHAnsi" w:cstheme="minorBidi"/>
+          <w:color w:val="auto"/>
+          <w:kern w:val="2"/>
+          <w:sz w:val="24"/>
+          <w:szCs w:val="24"/>
+          <w:lang w:eastAsia="en-US"/>
+          <w14:ligatures w14:val="standardContextual"/>
+        </w:rPr>
         <w:id w:val="-105577702"/>
         <w:docPartObj>
           <w:docPartGallery w:val="Table of Contents"/>
@@ -12,15 +21,8 @@
       </w:sdtPr>
       <w:sdtEndPr>
         <w:rPr>
-          <w:rFonts w:asciiTheme="minorHAnsi" w:eastAsiaTheme="minorHAnsi" w:hAnsiTheme="minorHAnsi" w:cstheme="minorBidi"/>
-          <w:b/>
-          <w:bCs/>
-          <w:color w:val="auto"/>
-          <w:kern w:val="2"/>
-          <w:sz w:val="24"/>
-          <w:szCs w:val="24"/>
-          <w:lang w:eastAsia="en-US"/>
-          <w14:ligatures w14:val="standardContextual"/>
+          <w:b/>
+          <w:bCs/>
         </w:rPr>
       </w:sdtEndPr>
       <w:sdtContent>
@@ -986,6 +988,40 @@
     </w:p>
     <w:p>
       <w:pPr>
+        <w:pStyle w:val="Akapitzlist"/>
+        <w:numPr>
+          <w:ilvl w:val="0"/>
+          <w:numId w:val="1"/>
+        </w:numPr>
+      </w:pPr>
+      <w:r>
+        <w:rPr>
+          <w:b/>
+          <w:bCs/>
+        </w:rPr>
+        <w:t>Menedżer Zasobów (Asset Manager)</w:t>
+      </w:r>
+      <w:r>
+        <w:t xml:space="preserve"> – centralny system zarządzania plikami gry (modele FBX, tekstury, shadery)</w:t>
+      </w:r>
+      <w:r>
+        <w:t xml:space="preserve">, który </w:t>
+      </w:r>
+      <w:r>
+        <w:t>odpowiada za unikanie duplikacji zasobów w pamięci RAM/VRAM (cache'owanie) oraz automatyczne zwalnianie niezarządzanej pamięci OpenGL przy przełączaniu poziomów.</w:t>
+      </w:r>
+      <w:r>
+        <w:t xml:space="preserve"> </w:t>
+      </w:r>
+      <w:r>
+        <w:rPr>
+          <w:highlight w:val="green"/>
+        </w:rPr>
+        <w:t>PEWNIAK</w:t>
+      </w:r>
+    </w:p>
+    <w:p>
+      <w:pPr>
         <w:pStyle w:val="Nagwek3"/>
       </w:pPr>
       <w:bookmarkStart w:id="3" w:name="_Toc235904859"/>
@@ -1155,7 +1191,7 @@
 </file>
 
 <file path=word/numbering.xml><?xml version="1.0" encoding="utf-8"?>
-<w:numbering xmlns:wpc="http://schemas.microsoft.com/office/word/2010/wordprocessingCanvas" xmlns:cx="http://schemas.microsoft.com/office/drawing/2014/chartex" xmlns:cx1="http://schemas.microsoft.com/office/drawing/2015/9/8/chartex" xmlns:cx2="http://schemas.microsoft.com/office/drawing/2015/10/21/chartex" xmlns:cx3="http://schemas.microsoft.com/office/drawing/2016/5/9/chartex" xmlns:cx4="http://schemas.microsoft.com/office/drawing/2016/5/10/chartex" xmlns:cx5="http://schemas.microsoft.com/office/drawing/2016/5/11/chartex" xmlns:cx6="http://schemas.microsoft.com/office/drawing/2016/5/12/chartex" xmlns:cx7="http://schemas.microsoft.com/office/drawing/2016/5/13/chartex" xmlns:cx8="http://schemas.microsoft.com/office/drawing/2016/5/14/chartex" xmlns:mc="http://schemas.openxmlformats.org/markup-compatibility/2006" xmlns:aink="http://schemas.microsoft.com/office/drawing/2016/ink" xmlns:am3d="http://schemas.microsoft.com/office/drawing/2017/model3d" xmlns:o="urn:schemas-microsoft-com:office:office" xmlns:oel="http://schemas.microsoft.com/office/2019/extlst" xmlns:r="http://schemas.openxmlformats.org/officeDocument/2006/relationships" xmlns:m="http://schemas.openxmlformats.org/officeDocument/2006/math" xmlns:v="urn:schemas-microsoft-com:vml" xmlns:wp14="http://schemas.microsoft.com/office/word/2010/wordprocessingDrawing" xmlns:wp="http://schemas.openxmlformats.org/drawingml/2006/wordprocessingDrawing" xmlns:w10="urn:schemas-microsoft-com:office:word" xmlns:w="http://schemas.openxmlformats.org/wordprocessingml/2006/main" xmlns:w14="http://schemas.microsoft.com/office/word/2010/wordml" xmlns:w15="http://schemas.microsoft.com/office/word/2012/wordml" xmlns:w16cex="http://schemas.microsoft.com/office/word/2018/wordml/cex" xmlns:w16cid="http://schemas.microsoft.com/office/word/2016/wordml/cid" xmlns:w16="http://schemas.microsoft.com/office/word/2018/wordml" xmlns:w16du="http://schemas.microsoft.com/office/word/2023/wordml/word16du" xmlns:w16sdtdh="http://schemas.microsoft.com/office/word/2020/wordml/sdtdatahash" xmlns:w16sdtfl="http://schemas.microsoft.com/office/word/2024/wordml/sdtformatlock" xmlns:w16se="http://schemas.microsoft.com/office/word/2015/wordml/symex" xmlns:wpg="http://schemas.microsoft.com/office/word/2010/wordprocessingGroup" xmlns:wpi="http://schemas.microsoft.com/office/word/2010/wordprocessingInk" xmlns:wne="http://schemas.microsoft.com/office/word/2006/wordml" xmlns:wps="http://schemas.microsoft.com/office/word/2010/wordprocessingShape" mc:Ignorable="w14 w15 w16se w16cid w16 w16cex w16sdtdh w16sdtfl w16du wp14">
+<w:numbering xmlns:wpc="http://schemas.microsoft.com/office/word/2010/wordprocessingCanvas" xmlns:cx="http://schemas.microsoft.com/office/drawing/2014/chartex" xmlns:cx1="http://schemas.microsoft.com/office/drawing/2015/9/8/chartex" xmlns:cx2="http://schemas.microsoft.com/office/drawing/2015/10/21/chartex" xmlns:cx3="http://schemas.microsoft.com/office/drawing/2016/5/9/chartex" xmlns:cx4="http://schemas.microsoft.com/office/drawing/2016/5/10/chartex" xmlns:cx5="http://schemas.microsoft.com/office/drawing/2016/5/11/chartex" xmlns:cx6="http://schemas.microsoft.com/office/drawing/2016/5/12/chartex" xmlns:cx7="http://schemas.microsoft.com/office/drawing/2016/5/13/chartex" xmlns:cx8="http://schemas.microsoft.com/office/drawing/2016/5/14/chartex" xmlns:mc="http://schemas.openxmlformats.org/markup-compatibility/2006" xmlns:aink="http://schemas.microsoft.com/office/drawing/2016/ink" xmlns:am3d="http://schemas.microsoft.com/office/drawing/2017/model3d" xmlns:o="urn:schemas-microsoft-com:office:office" xmlns:oel="http://schemas.microsoft.com/office/2019/extlst" xmlns:r="http://schemas.openxmlformats.org/officeDocument/2006/relationships" xmlns:m="http://schemas.openxmlformats.org/officeDocument/2006/math" xmlns:v="urn:schemas-microsoft-com:vml" xmlns:wp14="http://schemas.microsoft.com/office/word/2010/wordprocessingDrawing" xmlns:wp="http://schemas.openxmlformats.org/drawingml/2006/wordprocessingDrawing" xmlns:w10="urn:schemas-microsoft-com:office:word" xmlns:w="http://schemas.openxmlformats.org/wordprocessingml/2006/main" xmlns:w14="http://schemas.microsoft.com/office/word/2010/wordml" xmlns:w15="http://schemas.microsoft.com/office/word/2012/wordml" xmlns:w16cei="http://schemas.microsoft.com/office/word/2026/wordml/cei" xmlns:w16cex="http://schemas.microsoft.com/office/word/2018/wordml/cex" xmlns:w16cid="http://schemas.microsoft.com/office/word/2016/wordml/cid" xmlns:w16="http://schemas.microsoft.com/office/word/2018/wordml" xmlns:w16du="http://schemas.microsoft.com/office/word/2023/wordml/word16du" xmlns:w16sdtdh="http://schemas.microsoft.com/office/word/2020/wordml/sdtdatahash" xmlns:w16sdtfl="http://schemas.microsoft.com/office/word/2024/wordml/sdtformatlock" xmlns:w16se="http://schemas.microsoft.com/office/word/2015/wordml/symex" xmlns:wpg="http://schemas.microsoft.com/office/word/2010/wordprocessingGroup" xmlns:wpi="http://schemas.microsoft.com/office/word/2010/wordprocessingInk" xmlns:wne="http://schemas.microsoft.com/office/word/2006/wordml" xmlns:wps="http://schemas.microsoft.com/office/word/2010/wordprocessingShape" mc:Ignorable="w14 w15 w16se w16cid w16 w16cex w16sdtdh w16sdtfl w16du wp14">
   <w:abstractNum w:abstractNumId="0" w15:restartNumberingAfterBreak="0">
     <w:nsid w:val="70357702"/>
     <w:multiLevelType w:val="hybridMultilevel"/>
@@ -1172,7 +1208,7 @@
         <w:rFonts w:ascii="Symbol" w:hAnsi="Symbol" w:hint="default"/>
       </w:rPr>
     </w:lvl>
-    <w:lvl w:ilvl="1" w:tplc="04150003" w:tentative="1">
+    <w:lvl w:ilvl="1" w:tplc="04150003">
       <w:start w:val="1"/>
       <w:numFmt w:val="bullet"/>
       <w:lvlText w:val="o"/>

</xml_diff>

<commit_message>
Dodano sekcje: "Podział na priorytety" oraz "Elementy już zaimplementowane" (ustrukturyzowanie opisu które było w skecji "Elementy które są po części zaimplementowane w silniku")
</commit_message>
<xml_diff>
--- a/Doc/Elementy do silnika 3D.docx
+++ b/Doc/Elementy do silnika 3D.docx
@@ -66,7 +66,7 @@
           <w:r>
             <w:fldChar w:fldCharType="separate"/>
           </w:r>
-          <w:hyperlink w:anchor="_Toc235904856" w:history="1">
+          <w:hyperlink w:anchor="_Toc236600319" w:history="1">
             <w:r>
               <w:rPr>
                 <w:rStyle w:val="Hipercze"/>
@@ -95,7 +95,7 @@
                 <w:noProof/>
                 <w:webHidden/>
               </w:rPr>
-              <w:instrText xml:space="preserve"> PAGEREF _Toc235904856 \h </w:instrText>
+              <w:instrText xml:space="preserve"> PAGEREF _Toc236600319 \h </w:instrText>
             </w:r>
             <w:r>
               <w:rPr>
@@ -138,7 +138,7 @@
               <w:lang w:eastAsia="pl-PL"/>
             </w:rPr>
           </w:pPr>
-          <w:hyperlink w:anchor="_Toc235904857" w:history="1">
+          <w:hyperlink w:anchor="_Toc236600320" w:history="1">
             <w:r>
               <w:rPr>
                 <w:rStyle w:val="Hipercze"/>
@@ -167,7 +167,7 @@
                 <w:noProof/>
                 <w:webHidden/>
               </w:rPr>
-              <w:instrText xml:space="preserve"> PAGEREF _Toc235904857 \h </w:instrText>
+              <w:instrText xml:space="preserve"> PAGEREF _Toc236600320 \h </w:instrText>
             </w:r>
             <w:r>
               <w:rPr>
@@ -210,7 +210,7 @@
               <w:lang w:eastAsia="pl-PL"/>
             </w:rPr>
           </w:pPr>
-          <w:hyperlink w:anchor="_Toc235904858" w:history="1">
+          <w:hyperlink w:anchor="_Toc236600321" w:history="1">
             <w:r>
               <w:rPr>
                 <w:rStyle w:val="Hipercze"/>
@@ -237,7 +237,7 @@
                 <w:noProof/>
                 <w:webHidden/>
               </w:rPr>
-              <w:instrText xml:space="preserve"> PAGEREF _Toc235904858 \h </w:instrText>
+              <w:instrText xml:space="preserve"> PAGEREF _Toc236600321 \h </w:instrText>
             </w:r>
             <w:r>
               <w:rPr>
@@ -280,7 +280,7 @@
               <w:lang w:eastAsia="pl-PL"/>
             </w:rPr>
           </w:pPr>
-          <w:hyperlink w:anchor="_Toc235904859" w:history="1">
+          <w:hyperlink w:anchor="_Toc236600322" w:history="1">
             <w:r>
               <w:rPr>
                 <w:rStyle w:val="Hipercze"/>
@@ -307,7 +307,7 @@
                 <w:noProof/>
                 <w:webHidden/>
               </w:rPr>
-              <w:instrText xml:space="preserve"> PAGEREF _Toc235904859 \h </w:instrText>
+              <w:instrText xml:space="preserve"> PAGEREF _Toc236600322 \h </w:instrText>
             </w:r>
             <w:r>
               <w:rPr>
@@ -328,6 +328,570 @@
                 <w:webHidden/>
               </w:rPr>
               <w:t>3</w:t>
+            </w:r>
+            <w:r>
+              <w:rPr>
+                <w:noProof/>
+                <w:webHidden/>
+              </w:rPr>
+              <w:fldChar w:fldCharType="end"/>
+            </w:r>
+          </w:hyperlink>
+        </w:p>
+        <w:p>
+          <w:pPr>
+            <w:pStyle w:val="Spistreci1"/>
+            <w:tabs>
+              <w:tab w:val="right" w:leader="dot" w:pos="9062"/>
+            </w:tabs>
+            <w:rPr>
+              <w:rFonts w:eastAsiaTheme="minorEastAsia"/>
+              <w:noProof/>
+              <w:lang w:eastAsia="pl-PL"/>
+            </w:rPr>
+          </w:pPr>
+          <w:hyperlink w:anchor="_Toc236600323" w:history="1">
+            <w:r>
+              <w:rPr>
+                <w:rStyle w:val="Hipercze"/>
+                <w:b/>
+                <w:bCs/>
+                <w:noProof/>
+              </w:rPr>
+              <w:t>PODZIAŁ NA PRIORYTETY</w:t>
+            </w:r>
+            <w:r>
+              <w:rPr>
+                <w:noProof/>
+                <w:webHidden/>
+              </w:rPr>
+              <w:tab/>
+            </w:r>
+            <w:r>
+              <w:rPr>
+                <w:noProof/>
+                <w:webHidden/>
+              </w:rPr>
+              <w:fldChar w:fldCharType="begin"/>
+            </w:r>
+            <w:r>
+              <w:rPr>
+                <w:noProof/>
+                <w:webHidden/>
+              </w:rPr>
+              <w:instrText xml:space="preserve"> PAGEREF _Toc236600323 \h </w:instrText>
+            </w:r>
+            <w:r>
+              <w:rPr>
+                <w:noProof/>
+                <w:webHidden/>
+              </w:rPr>
+            </w:r>
+            <w:r>
+              <w:rPr>
+                <w:noProof/>
+                <w:webHidden/>
+              </w:rPr>
+              <w:fldChar w:fldCharType="separate"/>
+            </w:r>
+            <w:r>
+              <w:rPr>
+                <w:noProof/>
+                <w:webHidden/>
+              </w:rPr>
+              <w:t>3</w:t>
+            </w:r>
+            <w:r>
+              <w:rPr>
+                <w:noProof/>
+                <w:webHidden/>
+              </w:rPr>
+              <w:fldChar w:fldCharType="end"/>
+            </w:r>
+          </w:hyperlink>
+        </w:p>
+        <w:p>
+          <w:pPr>
+            <w:pStyle w:val="Spistreci2"/>
+            <w:tabs>
+              <w:tab w:val="right" w:leader="dot" w:pos="9062"/>
+            </w:tabs>
+            <w:rPr>
+              <w:rFonts w:eastAsiaTheme="minorEastAsia"/>
+              <w:noProof/>
+              <w:lang w:eastAsia="pl-PL"/>
+            </w:rPr>
+          </w:pPr>
+          <w:hyperlink w:anchor="_Toc236600324" w:history="1">
+            <w:r>
+              <w:rPr>
+                <w:rStyle w:val="Hipercze"/>
+                <w:noProof/>
+              </w:rPr>
+              <w:t>PRIORYTET 0 — Fundament silnika (bez tego nie ma sensu iść dalej)</w:t>
+            </w:r>
+            <w:r>
+              <w:rPr>
+                <w:noProof/>
+                <w:webHidden/>
+              </w:rPr>
+              <w:tab/>
+            </w:r>
+            <w:r>
+              <w:rPr>
+                <w:noProof/>
+                <w:webHidden/>
+              </w:rPr>
+              <w:fldChar w:fldCharType="begin"/>
+            </w:r>
+            <w:r>
+              <w:rPr>
+                <w:noProof/>
+                <w:webHidden/>
+              </w:rPr>
+              <w:instrText xml:space="preserve"> PAGEREF _Toc236600324 \h </w:instrText>
+            </w:r>
+            <w:r>
+              <w:rPr>
+                <w:noProof/>
+                <w:webHidden/>
+              </w:rPr>
+            </w:r>
+            <w:r>
+              <w:rPr>
+                <w:noProof/>
+                <w:webHidden/>
+              </w:rPr>
+              <w:fldChar w:fldCharType="separate"/>
+            </w:r>
+            <w:r>
+              <w:rPr>
+                <w:noProof/>
+                <w:webHidden/>
+              </w:rPr>
+              <w:t>3</w:t>
+            </w:r>
+            <w:r>
+              <w:rPr>
+                <w:noProof/>
+                <w:webHidden/>
+              </w:rPr>
+              <w:fldChar w:fldCharType="end"/>
+            </w:r>
+          </w:hyperlink>
+        </w:p>
+        <w:p>
+          <w:pPr>
+            <w:pStyle w:val="Spistreci2"/>
+            <w:tabs>
+              <w:tab w:val="right" w:leader="dot" w:pos="9062"/>
+            </w:tabs>
+            <w:rPr>
+              <w:rFonts w:eastAsiaTheme="minorEastAsia"/>
+              <w:noProof/>
+              <w:lang w:eastAsia="pl-PL"/>
+            </w:rPr>
+          </w:pPr>
+          <w:hyperlink w:anchor="_Toc236600325" w:history="1">
+            <w:r>
+              <w:rPr>
+                <w:rStyle w:val="Hipercze"/>
+                <w:noProof/>
+              </w:rPr>
+              <w:t>PRIORYTET 1 — Rdzeń rozgrywki</w:t>
+            </w:r>
+            <w:r>
+              <w:rPr>
+                <w:noProof/>
+                <w:webHidden/>
+              </w:rPr>
+              <w:tab/>
+            </w:r>
+            <w:r>
+              <w:rPr>
+                <w:noProof/>
+                <w:webHidden/>
+              </w:rPr>
+              <w:fldChar w:fldCharType="begin"/>
+            </w:r>
+            <w:r>
+              <w:rPr>
+                <w:noProof/>
+                <w:webHidden/>
+              </w:rPr>
+              <w:instrText xml:space="preserve"> PAGEREF _Toc236600325 \h </w:instrText>
+            </w:r>
+            <w:r>
+              <w:rPr>
+                <w:noProof/>
+                <w:webHidden/>
+              </w:rPr>
+            </w:r>
+            <w:r>
+              <w:rPr>
+                <w:noProof/>
+                <w:webHidden/>
+              </w:rPr>
+              <w:fldChar w:fldCharType="separate"/>
+            </w:r>
+            <w:r>
+              <w:rPr>
+                <w:noProof/>
+                <w:webHidden/>
+              </w:rPr>
+              <w:t>4</w:t>
+            </w:r>
+            <w:r>
+              <w:rPr>
+                <w:noProof/>
+                <w:webHidden/>
+              </w:rPr>
+              <w:fldChar w:fldCharType="end"/>
+            </w:r>
+          </w:hyperlink>
+        </w:p>
+        <w:p>
+          <w:pPr>
+            <w:pStyle w:val="Spistreci2"/>
+            <w:tabs>
+              <w:tab w:val="right" w:leader="dot" w:pos="9062"/>
+            </w:tabs>
+            <w:rPr>
+              <w:rFonts w:eastAsiaTheme="minorEastAsia"/>
+              <w:noProof/>
+              <w:lang w:eastAsia="pl-PL"/>
+            </w:rPr>
+          </w:pPr>
+          <w:hyperlink w:anchor="_Toc236600326" w:history="1">
+            <w:r>
+              <w:rPr>
+                <w:rStyle w:val="Hipercze"/>
+                <w:noProof/>
+              </w:rPr>
+              <w:t>PRIORYTET 2 — Mechaniki charakterystyczne dla gry</w:t>
+            </w:r>
+            <w:r>
+              <w:rPr>
+                <w:noProof/>
+                <w:webHidden/>
+              </w:rPr>
+              <w:tab/>
+            </w:r>
+            <w:r>
+              <w:rPr>
+                <w:noProof/>
+                <w:webHidden/>
+              </w:rPr>
+              <w:fldChar w:fldCharType="begin"/>
+            </w:r>
+            <w:r>
+              <w:rPr>
+                <w:noProof/>
+                <w:webHidden/>
+              </w:rPr>
+              <w:instrText xml:space="preserve"> PAGEREF _Toc236600326 \h </w:instrText>
+            </w:r>
+            <w:r>
+              <w:rPr>
+                <w:noProof/>
+                <w:webHidden/>
+              </w:rPr>
+            </w:r>
+            <w:r>
+              <w:rPr>
+                <w:noProof/>
+                <w:webHidden/>
+              </w:rPr>
+              <w:fldChar w:fldCharType="separate"/>
+            </w:r>
+            <w:r>
+              <w:rPr>
+                <w:noProof/>
+                <w:webHidden/>
+              </w:rPr>
+              <w:t>4</w:t>
+            </w:r>
+            <w:r>
+              <w:rPr>
+                <w:noProof/>
+                <w:webHidden/>
+              </w:rPr>
+              <w:fldChar w:fldCharType="end"/>
+            </w:r>
+          </w:hyperlink>
+        </w:p>
+        <w:p>
+          <w:pPr>
+            <w:pStyle w:val="Spistreci2"/>
+            <w:tabs>
+              <w:tab w:val="right" w:leader="dot" w:pos="9062"/>
+            </w:tabs>
+            <w:rPr>
+              <w:rFonts w:eastAsiaTheme="minorEastAsia"/>
+              <w:noProof/>
+              <w:lang w:eastAsia="pl-PL"/>
+            </w:rPr>
+          </w:pPr>
+          <w:hyperlink w:anchor="_Toc236600327" w:history="1">
+            <w:r>
+              <w:rPr>
+                <w:rStyle w:val="Hipercze"/>
+                <w:noProof/>
+              </w:rPr>
+              <w:t>PRIORYTET 3 — Rozbudowa i optymalizacja</w:t>
+            </w:r>
+            <w:r>
+              <w:rPr>
+                <w:noProof/>
+                <w:webHidden/>
+              </w:rPr>
+              <w:tab/>
+            </w:r>
+            <w:r>
+              <w:rPr>
+                <w:noProof/>
+                <w:webHidden/>
+              </w:rPr>
+              <w:fldChar w:fldCharType="begin"/>
+            </w:r>
+            <w:r>
+              <w:rPr>
+                <w:noProof/>
+                <w:webHidden/>
+              </w:rPr>
+              <w:instrText xml:space="preserve"> PAGEREF _Toc236600327 \h </w:instrText>
+            </w:r>
+            <w:r>
+              <w:rPr>
+                <w:noProof/>
+                <w:webHidden/>
+              </w:rPr>
+            </w:r>
+            <w:r>
+              <w:rPr>
+                <w:noProof/>
+                <w:webHidden/>
+              </w:rPr>
+              <w:fldChar w:fldCharType="separate"/>
+            </w:r>
+            <w:r>
+              <w:rPr>
+                <w:noProof/>
+                <w:webHidden/>
+              </w:rPr>
+              <w:t>5</w:t>
+            </w:r>
+            <w:r>
+              <w:rPr>
+                <w:noProof/>
+                <w:webHidden/>
+              </w:rPr>
+              <w:fldChar w:fldCharType="end"/>
+            </w:r>
+          </w:hyperlink>
+        </w:p>
+        <w:p>
+          <w:pPr>
+            <w:pStyle w:val="Spistreci2"/>
+            <w:tabs>
+              <w:tab w:val="right" w:leader="dot" w:pos="9062"/>
+            </w:tabs>
+            <w:rPr>
+              <w:rFonts w:eastAsiaTheme="minorEastAsia"/>
+              <w:noProof/>
+              <w:lang w:eastAsia="pl-PL"/>
+            </w:rPr>
+          </w:pPr>
+          <w:hyperlink w:anchor="_Toc236600328" w:history="1">
+            <w:r>
+              <w:rPr>
+                <w:rStyle w:val="Hipercze"/>
+                <w:noProof/>
+              </w:rPr>
+              <w:t>PRIORYTET 4 — Narzędzia / edytor</w:t>
+            </w:r>
+            <w:r>
+              <w:rPr>
+                <w:noProof/>
+                <w:webHidden/>
+              </w:rPr>
+              <w:tab/>
+            </w:r>
+            <w:r>
+              <w:rPr>
+                <w:noProof/>
+                <w:webHidden/>
+              </w:rPr>
+              <w:fldChar w:fldCharType="begin"/>
+            </w:r>
+            <w:r>
+              <w:rPr>
+                <w:noProof/>
+                <w:webHidden/>
+              </w:rPr>
+              <w:instrText xml:space="preserve"> PAGEREF _Toc236600328 \h </w:instrText>
+            </w:r>
+            <w:r>
+              <w:rPr>
+                <w:noProof/>
+                <w:webHidden/>
+              </w:rPr>
+            </w:r>
+            <w:r>
+              <w:rPr>
+                <w:noProof/>
+                <w:webHidden/>
+              </w:rPr>
+              <w:fldChar w:fldCharType="separate"/>
+            </w:r>
+            <w:r>
+              <w:rPr>
+                <w:noProof/>
+                <w:webHidden/>
+              </w:rPr>
+              <w:t>5</w:t>
+            </w:r>
+            <w:r>
+              <w:rPr>
+                <w:noProof/>
+                <w:webHidden/>
+              </w:rPr>
+              <w:fldChar w:fldCharType="end"/>
+            </w:r>
+          </w:hyperlink>
+        </w:p>
+        <w:p>
+          <w:pPr>
+            <w:pStyle w:val="Spistreci2"/>
+            <w:tabs>
+              <w:tab w:val="right" w:leader="dot" w:pos="9062"/>
+            </w:tabs>
+            <w:rPr>
+              <w:rFonts w:eastAsiaTheme="minorEastAsia"/>
+              <w:noProof/>
+              <w:lang w:eastAsia="pl-PL"/>
+            </w:rPr>
+          </w:pPr>
+          <w:hyperlink w:anchor="_Toc236600329" w:history="1">
+            <w:r>
+              <w:rPr>
+                <w:rStyle w:val="Hipercze"/>
+                <w:noProof/>
+              </w:rPr>
+              <w:t>Sugerowana kolejność poszczególnych działań</w:t>
+            </w:r>
+            <w:r>
+              <w:rPr>
+                <w:noProof/>
+                <w:webHidden/>
+              </w:rPr>
+              <w:tab/>
+            </w:r>
+            <w:r>
+              <w:rPr>
+                <w:noProof/>
+                <w:webHidden/>
+              </w:rPr>
+              <w:fldChar w:fldCharType="begin"/>
+            </w:r>
+            <w:r>
+              <w:rPr>
+                <w:noProof/>
+                <w:webHidden/>
+              </w:rPr>
+              <w:instrText xml:space="preserve"> PAGEREF _Toc236600329 \h </w:instrText>
+            </w:r>
+            <w:r>
+              <w:rPr>
+                <w:noProof/>
+                <w:webHidden/>
+              </w:rPr>
+            </w:r>
+            <w:r>
+              <w:rPr>
+                <w:noProof/>
+                <w:webHidden/>
+              </w:rPr>
+              <w:fldChar w:fldCharType="separate"/>
+            </w:r>
+            <w:r>
+              <w:rPr>
+                <w:noProof/>
+                <w:webHidden/>
+              </w:rPr>
+              <w:t>6</w:t>
+            </w:r>
+            <w:r>
+              <w:rPr>
+                <w:noProof/>
+                <w:webHidden/>
+              </w:rPr>
+              <w:fldChar w:fldCharType="end"/>
+            </w:r>
+          </w:hyperlink>
+        </w:p>
+        <w:p>
+          <w:pPr>
+            <w:pStyle w:val="Spistreci1"/>
+            <w:tabs>
+              <w:tab w:val="right" w:leader="dot" w:pos="9062"/>
+            </w:tabs>
+            <w:rPr>
+              <w:rFonts w:eastAsiaTheme="minorEastAsia"/>
+              <w:noProof/>
+              <w:lang w:eastAsia="pl-PL"/>
+            </w:rPr>
+          </w:pPr>
+          <w:hyperlink w:anchor="_Toc236600330" w:history="1">
+            <w:r>
+              <w:rPr>
+                <w:rStyle w:val="Hipercze"/>
+                <w:b/>
+                <w:bCs/>
+                <w:noProof/>
+              </w:rPr>
+              <w:t>Elementy już zaimplementowane</w:t>
+            </w:r>
+            <w:r>
+              <w:rPr>
+                <w:noProof/>
+                <w:webHidden/>
+              </w:rPr>
+              <w:tab/>
+            </w:r>
+            <w:r>
+              <w:rPr>
+                <w:noProof/>
+                <w:webHidden/>
+              </w:rPr>
+              <w:fldChar w:fldCharType="begin"/>
+            </w:r>
+            <w:r>
+              <w:rPr>
+                <w:noProof/>
+                <w:webHidden/>
+              </w:rPr>
+              <w:instrText xml:space="preserve"> PAGEREF _Toc236600330 \h </w:instrText>
+            </w:r>
+            <w:r>
+              <w:rPr>
+                <w:noProof/>
+                <w:webHidden/>
+              </w:rPr>
+            </w:r>
+            <w:r>
+              <w:rPr>
+                <w:noProof/>
+                <w:webHidden/>
+              </w:rPr>
+              <w:fldChar w:fldCharType="separate"/>
+            </w:r>
+            <w:r>
+              <w:rPr>
+                <w:noProof/>
+                <w:webHidden/>
+              </w:rPr>
+              <w:t>6</w:t>
             </w:r>
             <w:r>
               <w:rPr>
@@ -377,7 +941,7 @@
           <w:bCs/>
         </w:rPr>
       </w:pPr>
-      <w:bookmarkStart w:id="0" w:name="_Toc235904856"/>
+      <w:bookmarkStart w:id="0" w:name="_Toc236600319"/>
       <w:r>
         <w:rPr>
           <w:b/>
@@ -410,7 +974,7 @@
           <w:bCs/>
         </w:rPr>
       </w:pPr>
-      <w:bookmarkStart w:id="1" w:name="_Toc235904857"/>
+      <w:bookmarkStart w:id="1" w:name="_Toc236600320"/>
       <w:r>
         <w:rPr>
           <w:b/>
@@ -436,7 +1000,7 @@
       <w:pPr>
         <w:pStyle w:val="Nagwek3"/>
       </w:pPr>
-      <w:bookmarkStart w:id="2" w:name="_Toc235904858"/>
+      <w:bookmarkStart w:id="2" w:name="_Toc236600321"/>
       <w:r>
         <w:t>Elementy do implementacji</w:t>
       </w:r>
@@ -736,6 +1300,15 @@
       <w:r>
         <w:t xml:space="preserve"> (?)</w:t>
       </w:r>
+      <w:r>
+        <w:t xml:space="preserve"> lub </w:t>
+      </w:r>
+      <w:r>
+        <w:rPr>
+          <w:highlight w:val="green"/>
+        </w:rPr>
+        <w:t>PEWNIAK</w:t>
+      </w:r>
     </w:p>
     <w:p>
       <w:pPr>
@@ -1024,7 +1597,7 @@
       <w:pPr>
         <w:pStyle w:val="Nagwek3"/>
       </w:pPr>
-      <w:bookmarkStart w:id="3" w:name="_Toc235904859"/>
+      <w:bookmarkStart w:id="3" w:name="_Toc236600322"/>
       <w:r>
         <w:t>Elementy, które już są po części zaimplementowane</w:t>
       </w:r>
@@ -1180,6 +1753,2083 @@
         <w:t>.</w:t>
       </w:r>
     </w:p>
+    <w:p/>
+    <w:p>
+      <w:pPr>
+        <w:pStyle w:val="Nagwek1"/>
+        <w:jc w:val="center"/>
+        <w:rPr>
+          <w:b/>
+          <w:bCs/>
+        </w:rPr>
+      </w:pPr>
+      <w:bookmarkStart w:id="4" w:name="_Toc236600323"/>
+      <w:r>
+        <w:rPr>
+          <w:b/>
+          <w:bCs/>
+        </w:rPr>
+        <w:t>PODZIAŁ NA PRIORYTETY</w:t>
+      </w:r>
+      <w:bookmarkEnd w:id="4"/>
+    </w:p>
+    <w:p>
+      <w:r>
+        <w:t>Podział na priorytety posłuży do lepszej organizacji pracy nad silnikiem i uniknięciem niepotrzebnych komplikacji w trakcie jego pisania. Priorytety są przyznawane w skali od 1 do 5. Cyfra 1 oznacza bardzo niski priorytet, natomiast cyfra 5 oznacza bardzo wysoki priorytet danego elementu silnika.</w:t>
+      </w:r>
+    </w:p>
+    <w:p/>
+    <w:p>
+      <w:pPr>
+        <w:pStyle w:val="Nagwek2"/>
+      </w:pPr>
+      <w:bookmarkStart w:id="5" w:name="_Toc236600324"/>
+      <w:r>
+        <w:t>PRIORYTET 0 — Fundament silnika (bez tego nie ma sensu iść dalej)</w:t>
+      </w:r>
+      <w:bookmarkEnd w:id="5"/>
+    </w:p>
+    <w:p>
+      <w:r>
+        <w:t>To są elementy, które powinny powstać jako pierwsze.</w:t>
+      </w:r>
+    </w:p>
+    <w:tbl>
+      <w:tblPr>
+        <w:tblW w:w="0" w:type="auto"/>
+        <w:tblCellSpacing w:w="15" w:type="dxa"/>
+        <w:tblBorders>
+          <w:top w:val="single" w:sz="4" w:space="0" w:color="auto"/>
+          <w:left w:val="single" w:sz="4" w:space="0" w:color="auto"/>
+          <w:bottom w:val="single" w:sz="4" w:space="0" w:color="auto"/>
+          <w:right w:val="single" w:sz="4" w:space="0" w:color="auto"/>
+          <w:insideH w:val="single" w:sz="4" w:space="0" w:color="auto"/>
+          <w:insideV w:val="single" w:sz="4" w:space="0" w:color="auto"/>
+        </w:tblBorders>
+        <w:tblCellMar>
+          <w:top w:w="15" w:type="dxa"/>
+          <w:left w:w="15" w:type="dxa"/>
+          <w:bottom w:w="15" w:type="dxa"/>
+          <w:right w:w="15" w:type="dxa"/>
+        </w:tblCellMar>
+        <w:tblLook w:val="04A0" w:firstRow="1" w:lastRow="0" w:firstColumn="1" w:lastColumn="0" w:noHBand="0" w:noVBand="1"/>
+      </w:tblPr>
+      <w:tblGrid>
+        <w:gridCol w:w="2961"/>
+        <w:gridCol w:w="1031"/>
+        <w:gridCol w:w="5070"/>
+      </w:tblGrid>
+      <w:tr>
+        <w:trPr>
+          <w:tblHeader/>
+          <w:tblCellSpacing w:w="15" w:type="dxa"/>
+        </w:trPr>
+        <w:tc>
+          <w:tcPr>
+            <w:tcW w:w="0" w:type="auto"/>
+            <w:vAlign w:val="center"/>
+            <w:hideMark/>
+          </w:tcPr>
+          <w:p>
+            <w:pPr>
+              <w:rPr>
+                <w:b/>
+                <w:bCs/>
+              </w:rPr>
+            </w:pPr>
+            <w:r>
+              <w:rPr>
+                <w:b/>
+                <w:bCs/>
+              </w:rPr>
+              <w:lastRenderedPageBreak/>
+              <w:t>Element</w:t>
+            </w:r>
+          </w:p>
+        </w:tc>
+        <w:tc>
+          <w:tcPr>
+            <w:tcW w:w="0" w:type="auto"/>
+            <w:vAlign w:val="center"/>
+            <w:hideMark/>
+          </w:tcPr>
+          <w:p>
+            <w:pPr>
+              <w:rPr>
+                <w:b/>
+                <w:bCs/>
+              </w:rPr>
+            </w:pPr>
+            <w:r>
+              <w:rPr>
+                <w:b/>
+                <w:bCs/>
+              </w:rPr>
+              <w:t>Priorytet</w:t>
+            </w:r>
+          </w:p>
+        </w:tc>
+        <w:tc>
+          <w:tcPr>
+            <w:tcW w:w="0" w:type="auto"/>
+            <w:vAlign w:val="center"/>
+            <w:hideMark/>
+          </w:tcPr>
+          <w:p>
+            <w:pPr>
+              <w:rPr>
+                <w:b/>
+                <w:bCs/>
+              </w:rPr>
+            </w:pPr>
+            <w:r>
+              <w:rPr>
+                <w:b/>
+                <w:bCs/>
+              </w:rPr>
+              <w:t>Uzasadnienie</w:t>
+            </w:r>
+          </w:p>
+        </w:tc>
+      </w:tr>
+      <w:tr>
+        <w:trPr>
+          <w:tblCellSpacing w:w="15" w:type="dxa"/>
+        </w:trPr>
+        <w:tc>
+          <w:tcPr>
+            <w:tcW w:w="0" w:type="auto"/>
+            <w:vAlign w:val="center"/>
+            <w:hideMark/>
+          </w:tcPr>
+          <w:p>
+            <w:r>
+              <w:rPr>
+                <w:b/>
+                <w:bCs/>
+              </w:rPr>
+              <w:t>ECS (Entity Component System)</w:t>
+            </w:r>
+          </w:p>
+        </w:tc>
+        <w:tc>
+          <w:tcPr>
+            <w:tcW w:w="0" w:type="auto"/>
+            <w:vAlign w:val="center"/>
+            <w:hideMark/>
+          </w:tcPr>
+          <w:p>
+            <w:pPr>
+              <w:jc w:val="center"/>
+            </w:pPr>
+            <w:r>
+              <w:rPr>
+                <w:rFonts w:ascii="Segoe UI Emoji" w:hAnsi="Segoe UI Emoji" w:cs="Segoe UI Emoji"/>
+              </w:rPr>
+              <w:t>5</w:t>
+            </w:r>
+          </w:p>
+        </w:tc>
+        <w:tc>
+          <w:tcPr>
+            <w:tcW w:w="0" w:type="auto"/>
+            <w:vAlign w:val="center"/>
+            <w:hideMark/>
+          </w:tcPr>
+          <w:p>
+            <w:r>
+              <w:t>Najważniejszy brakujący element. Wszystkie obiekty gry powinny być zarządzane przez komponenty i systemy.</w:t>
+            </w:r>
+          </w:p>
+        </w:tc>
+      </w:tr>
+      <w:tr>
+        <w:trPr>
+          <w:tblCellSpacing w:w="15" w:type="dxa"/>
+        </w:trPr>
+        <w:tc>
+          <w:tcPr>
+            <w:tcW w:w="0" w:type="auto"/>
+            <w:vAlign w:val="center"/>
+            <w:hideMark/>
+          </w:tcPr>
+          <w:p>
+            <w:r>
+              <w:rPr>
+                <w:b/>
+                <w:bCs/>
+              </w:rPr>
+              <w:t>Asset Manager</w:t>
+            </w:r>
+          </w:p>
+        </w:tc>
+        <w:tc>
+          <w:tcPr>
+            <w:tcW w:w="0" w:type="auto"/>
+            <w:vAlign w:val="center"/>
+            <w:hideMark/>
+          </w:tcPr>
+          <w:p>
+            <w:pPr>
+              <w:jc w:val="center"/>
+            </w:pPr>
+            <w:r>
+              <w:rPr>
+                <w:rFonts w:ascii="Segoe UI Emoji" w:hAnsi="Segoe UI Emoji" w:cs="Segoe UI Emoji"/>
+              </w:rPr>
+              <w:t>5</w:t>
+            </w:r>
+          </w:p>
+        </w:tc>
+        <w:tc>
+          <w:tcPr>
+            <w:tcW w:w="0" w:type="auto"/>
+            <w:vAlign w:val="center"/>
+            <w:hideMark/>
+          </w:tcPr>
+          <w:p>
+            <w:r>
+              <w:t>Potrzebny do kontrolowania modeli, tekstur, shaderów i pamięci GPU.</w:t>
+            </w:r>
+          </w:p>
+        </w:tc>
+      </w:tr>
+      <w:tr>
+        <w:trPr>
+          <w:tblCellSpacing w:w="15" w:type="dxa"/>
+        </w:trPr>
+        <w:tc>
+          <w:tcPr>
+            <w:tcW w:w="0" w:type="auto"/>
+            <w:vAlign w:val="center"/>
+            <w:hideMark/>
+          </w:tcPr>
+          <w:p>
+            <w:r>
+              <w:rPr>
+                <w:b/>
+                <w:bCs/>
+              </w:rPr>
+              <w:t>Kamera + system macierzy + izometria</w:t>
+            </w:r>
+          </w:p>
+        </w:tc>
+        <w:tc>
+          <w:tcPr>
+            <w:tcW w:w="0" w:type="auto"/>
+            <w:vAlign w:val="center"/>
+            <w:hideMark/>
+          </w:tcPr>
+          <w:p>
+            <w:pPr>
+              <w:jc w:val="center"/>
+            </w:pPr>
+            <w:r>
+              <w:rPr>
+                <w:rFonts w:ascii="Segoe UI Emoji" w:hAnsi="Segoe UI Emoji" w:cs="Segoe UI Emoji"/>
+              </w:rPr>
+              <w:t>5</w:t>
+            </w:r>
+          </w:p>
+        </w:tc>
+        <w:tc>
+          <w:tcPr>
+            <w:tcW w:w="0" w:type="auto"/>
+            <w:vAlign w:val="center"/>
+            <w:hideMark/>
+          </w:tcPr>
+          <w:p>
+            <w:r>
+              <w:t>Obecny renderer potrzebuje warstwy zarządzania sceną i widokiem świata.</w:t>
+            </w:r>
+          </w:p>
+        </w:tc>
+      </w:tr>
+      <w:tr>
+        <w:trPr>
+          <w:tblCellSpacing w:w="15" w:type="dxa"/>
+        </w:trPr>
+        <w:tc>
+          <w:tcPr>
+            <w:tcW w:w="0" w:type="auto"/>
+            <w:vAlign w:val="center"/>
+            <w:hideMark/>
+          </w:tcPr>
+          <w:p>
+            <w:r>
+              <w:rPr>
+                <w:b/>
+                <w:bCs/>
+              </w:rPr>
+              <w:t>Renderowanie encji ECS</w:t>
+            </w:r>
+          </w:p>
+        </w:tc>
+        <w:tc>
+          <w:tcPr>
+            <w:tcW w:w="0" w:type="auto"/>
+            <w:vAlign w:val="center"/>
+            <w:hideMark/>
+          </w:tcPr>
+          <w:p>
+            <w:pPr>
+              <w:jc w:val="center"/>
+            </w:pPr>
+            <w:r>
+              <w:rPr>
+                <w:rFonts w:ascii="Segoe UI Emoji" w:hAnsi="Segoe UI Emoji" w:cs="Segoe UI Emoji"/>
+              </w:rPr>
+              <w:t>5</w:t>
+            </w:r>
+          </w:p>
+        </w:tc>
+        <w:tc>
+          <w:tcPr>
+            <w:tcW w:w="0" w:type="auto"/>
+            <w:vAlign w:val="center"/>
+            <w:hideMark/>
+          </w:tcPr>
+          <w:p>
+            <w:r>
+              <w:t>Połączenie obecnego renderera z architekturą gry.</w:t>
+            </w:r>
+          </w:p>
+        </w:tc>
+      </w:tr>
+      <w:tr>
+        <w:trPr>
+          <w:tblCellSpacing w:w="15" w:type="dxa"/>
+        </w:trPr>
+        <w:tc>
+          <w:tcPr>
+            <w:tcW w:w="0" w:type="auto"/>
+            <w:vAlign w:val="center"/>
+            <w:hideMark/>
+          </w:tcPr>
+          <w:p>
+            <w:r>
+              <w:rPr>
+                <w:b/>
+                <w:bCs/>
+              </w:rPr>
+              <w:t>Zarządzanie pamięcią (Object Pool/Flyweight)</w:t>
+            </w:r>
+          </w:p>
+        </w:tc>
+        <w:tc>
+          <w:tcPr>
+            <w:tcW w:w="0" w:type="auto"/>
+            <w:vAlign w:val="center"/>
+            <w:hideMark/>
+          </w:tcPr>
+          <w:p>
+            <w:pPr>
+              <w:jc w:val="center"/>
+            </w:pPr>
+            <w:r>
+              <w:rPr>
+                <w:rFonts w:ascii="Segoe UI Emoji" w:hAnsi="Segoe UI Emoji" w:cs="Segoe UI Emoji"/>
+              </w:rPr>
+              <w:t>5</w:t>
+            </w:r>
+          </w:p>
+        </w:tc>
+        <w:tc>
+          <w:tcPr>
+            <w:tcW w:w="0" w:type="auto"/>
+            <w:vAlign w:val="center"/>
+            <w:hideMark/>
+          </w:tcPr>
+          <w:p>
+            <w:r>
+              <w:t>Ważne po pojawieniu się dużej liczby encji ECS.</w:t>
+            </w:r>
+          </w:p>
+        </w:tc>
+      </w:tr>
+    </w:tbl>
+    <w:p/>
+    <w:p>
+      <w:pPr>
+        <w:pStyle w:val="Nagwek2"/>
+      </w:pPr>
+      <w:bookmarkStart w:id="6" w:name="_Toc236600325"/>
+      <w:r>
+        <w:t>PRIORYTET 1 — Rdzeń rozgrywki</w:t>
+      </w:r>
+      <w:bookmarkEnd w:id="6"/>
+    </w:p>
+    <w:p>
+      <w:r>
+        <w:t>Elementy potrzebne, aby silnik zaczął być „silnikiem gry”, a nie tylko rendererem.</w:t>
+      </w:r>
+    </w:p>
+    <w:tbl>
+      <w:tblPr>
+        <w:tblW w:w="0" w:type="auto"/>
+        <w:tblCellSpacing w:w="15" w:type="dxa"/>
+        <w:tblBorders>
+          <w:top w:val="single" w:sz="4" w:space="0" w:color="auto"/>
+          <w:left w:val="single" w:sz="4" w:space="0" w:color="auto"/>
+          <w:bottom w:val="single" w:sz="4" w:space="0" w:color="auto"/>
+          <w:right w:val="single" w:sz="4" w:space="0" w:color="auto"/>
+          <w:insideH w:val="single" w:sz="4" w:space="0" w:color="auto"/>
+          <w:insideV w:val="single" w:sz="4" w:space="0" w:color="auto"/>
+        </w:tblBorders>
+        <w:tblCellMar>
+          <w:top w:w="15" w:type="dxa"/>
+          <w:left w:w="15" w:type="dxa"/>
+          <w:bottom w:w="15" w:type="dxa"/>
+          <w:right w:w="15" w:type="dxa"/>
+        </w:tblCellMar>
+        <w:tblLook w:val="04A0" w:firstRow="1" w:lastRow="0" w:firstColumn="1" w:lastColumn="0" w:noHBand="0" w:noVBand="1"/>
+      </w:tblPr>
+      <w:tblGrid>
+        <w:gridCol w:w="2751"/>
+        <w:gridCol w:w="1031"/>
+        <w:gridCol w:w="5280"/>
+      </w:tblGrid>
+      <w:tr>
+        <w:trPr>
+          <w:tblHeader/>
+          <w:tblCellSpacing w:w="15" w:type="dxa"/>
+        </w:trPr>
+        <w:tc>
+          <w:tcPr>
+            <w:tcW w:w="0" w:type="auto"/>
+            <w:vAlign w:val="center"/>
+            <w:hideMark/>
+          </w:tcPr>
+          <w:p>
+            <w:pPr>
+              <w:rPr>
+                <w:b/>
+                <w:bCs/>
+              </w:rPr>
+            </w:pPr>
+            <w:r>
+              <w:rPr>
+                <w:b/>
+                <w:bCs/>
+              </w:rPr>
+              <w:t>Element</w:t>
+            </w:r>
+          </w:p>
+        </w:tc>
+        <w:tc>
+          <w:tcPr>
+            <w:tcW w:w="0" w:type="auto"/>
+            <w:vAlign w:val="center"/>
+            <w:hideMark/>
+          </w:tcPr>
+          <w:p>
+            <w:pPr>
+              <w:rPr>
+                <w:b/>
+                <w:bCs/>
+              </w:rPr>
+            </w:pPr>
+            <w:r>
+              <w:rPr>
+                <w:b/>
+                <w:bCs/>
+              </w:rPr>
+              <w:t>Priorytet</w:t>
+            </w:r>
+          </w:p>
+        </w:tc>
+        <w:tc>
+          <w:tcPr>
+            <w:tcW w:w="0" w:type="auto"/>
+            <w:vAlign w:val="center"/>
+            <w:hideMark/>
+          </w:tcPr>
+          <w:p>
+            <w:pPr>
+              <w:rPr>
+                <w:b/>
+                <w:bCs/>
+              </w:rPr>
+            </w:pPr>
+            <w:r>
+              <w:rPr>
+                <w:b/>
+                <w:bCs/>
+              </w:rPr>
+              <w:t>Uzasadnienie</w:t>
+            </w:r>
+          </w:p>
+        </w:tc>
+      </w:tr>
+      <w:tr>
+        <w:trPr>
+          <w:tblCellSpacing w:w="15" w:type="dxa"/>
+        </w:trPr>
+        <w:tc>
+          <w:tcPr>
+            <w:tcW w:w="0" w:type="auto"/>
+            <w:vAlign w:val="center"/>
+            <w:hideMark/>
+          </w:tcPr>
+          <w:p>
+            <w:r>
+              <w:rPr>
+                <w:b/>
+                <w:bCs/>
+              </w:rPr>
+              <w:t>Event Queue</w:t>
+            </w:r>
+          </w:p>
+        </w:tc>
+        <w:tc>
+          <w:tcPr>
+            <w:tcW w:w="0" w:type="auto"/>
+            <w:vAlign w:val="center"/>
+            <w:hideMark/>
+          </w:tcPr>
+          <w:p>
+            <w:pPr>
+              <w:jc w:val="center"/>
+            </w:pPr>
+            <w:r>
+              <w:rPr>
+                <w:rFonts w:ascii="Segoe UI Emoji" w:hAnsi="Segoe UI Emoji" w:cs="Segoe UI Emoji"/>
+              </w:rPr>
+              <w:t>5</w:t>
+            </w:r>
+          </w:p>
+        </w:tc>
+        <w:tc>
+          <w:tcPr>
+            <w:tcW w:w="0" w:type="auto"/>
+            <w:vAlign w:val="center"/>
+            <w:hideMark/>
+          </w:tcPr>
+          <w:p>
+            <w:r>
+              <w:t>Bezpieczna komunikacja między silnikiem, UI i systemami.</w:t>
+            </w:r>
+          </w:p>
+        </w:tc>
+      </w:tr>
+      <w:tr>
+        <w:trPr>
+          <w:tblCellSpacing w:w="15" w:type="dxa"/>
+        </w:trPr>
+        <w:tc>
+          <w:tcPr>
+            <w:tcW w:w="0" w:type="auto"/>
+            <w:vAlign w:val="center"/>
+            <w:hideMark/>
+          </w:tcPr>
+          <w:p>
+            <w:r>
+              <w:rPr>
+                <w:b/>
+                <w:bCs/>
+              </w:rPr>
+              <w:t>Command Buffer</w:t>
+            </w:r>
+          </w:p>
+        </w:tc>
+        <w:tc>
+          <w:tcPr>
+            <w:tcW w:w="0" w:type="auto"/>
+            <w:vAlign w:val="center"/>
+            <w:hideMark/>
+          </w:tcPr>
+          <w:p>
+            <w:pPr>
+              <w:jc w:val="center"/>
+            </w:pPr>
+            <w:r>
+              <w:rPr>
+                <w:rFonts w:ascii="Segoe UI Emoji" w:hAnsi="Segoe UI Emoji" w:cs="Segoe UI Emoji"/>
+              </w:rPr>
+              <w:t>5</w:t>
+            </w:r>
+          </w:p>
+        </w:tc>
+        <w:tc>
+          <w:tcPr>
+            <w:tcW w:w="0" w:type="auto"/>
+            <w:vAlign w:val="center"/>
+            <w:hideMark/>
+          </w:tcPr>
+          <w:p>
+            <w:r>
+              <w:t>Oddzielenie działań użytkownika od bezpośredniej modyfikacji świata.</w:t>
+            </w:r>
+          </w:p>
+        </w:tc>
+      </w:tr>
+      <w:tr>
+        <w:trPr>
+          <w:tblCellSpacing w:w="15" w:type="dxa"/>
+        </w:trPr>
+        <w:tc>
+          <w:tcPr>
+            <w:tcW w:w="0" w:type="auto"/>
+            <w:vAlign w:val="center"/>
+            <w:hideMark/>
+          </w:tcPr>
+          <w:p>
+            <w:r>
+              <w:rPr>
+                <w:b/>
+                <w:bCs/>
+              </w:rPr>
+              <w:t>Scene Manager</w:t>
+            </w:r>
+          </w:p>
+        </w:tc>
+        <w:tc>
+          <w:tcPr>
+            <w:tcW w:w="0" w:type="auto"/>
+            <w:vAlign w:val="center"/>
+            <w:hideMark/>
+          </w:tcPr>
+          <w:p>
+            <w:pPr>
+              <w:jc w:val="center"/>
+            </w:pPr>
+            <w:r>
+              <w:rPr>
+                <w:rFonts w:ascii="Segoe UI Emoji" w:hAnsi="Segoe UI Emoji" w:cs="Segoe UI Emoji"/>
+              </w:rPr>
+              <w:t>5</w:t>
+            </w:r>
+          </w:p>
+        </w:tc>
+        <w:tc>
+          <w:tcPr>
+            <w:tcW w:w="0" w:type="auto"/>
+            <w:vAlign w:val="center"/>
+            <w:hideMark/>
+          </w:tcPr>
+          <w:p>
+            <w:r>
+              <w:t>Zarządzanie menu, rozgrywką, ekranem śmierci itd.</w:t>
+            </w:r>
+          </w:p>
+        </w:tc>
+      </w:tr>
+      <w:tr>
+        <w:trPr>
+          <w:tblCellSpacing w:w="15" w:type="dxa"/>
+        </w:trPr>
+        <w:tc>
+          <w:tcPr>
+            <w:tcW w:w="0" w:type="auto"/>
+            <w:vAlign w:val="center"/>
+            <w:hideMark/>
+          </w:tcPr>
+          <w:p>
+            <w:pPr>
+              <w:rPr>
+                <w:lang w:val="en-GB"/>
+              </w:rPr>
+            </w:pPr>
+            <w:r>
+              <w:rPr>
+                <w:b/>
+                <w:bCs/>
+                <w:lang w:val="en-GB"/>
+              </w:rPr>
+              <w:t>Data Driven Design (JSON/XML)</w:t>
+            </w:r>
+          </w:p>
+        </w:tc>
+        <w:tc>
+          <w:tcPr>
+            <w:tcW w:w="0" w:type="auto"/>
+            <w:vAlign w:val="center"/>
+            <w:hideMark/>
+          </w:tcPr>
+          <w:p>
+            <w:pPr>
+              <w:jc w:val="center"/>
+            </w:pPr>
+            <w:r>
+              <w:rPr>
+                <w:rFonts w:ascii="Segoe UI Emoji" w:hAnsi="Segoe UI Emoji" w:cs="Segoe UI Emoji"/>
+              </w:rPr>
+              <w:t>5</w:t>
+            </w:r>
+          </w:p>
+        </w:tc>
+        <w:tc>
+          <w:tcPr>
+            <w:tcW w:w="0" w:type="auto"/>
+            <w:vAlign w:val="center"/>
+            <w:hideMark/>
+          </w:tcPr>
+          <w:p>
+            <w:r>
+              <w:t>Oddzielenie danych gry od kodu.</w:t>
+            </w:r>
+          </w:p>
+        </w:tc>
+      </w:tr>
+    </w:tbl>
+    <w:p/>
+    <w:p>
+      <w:pPr>
+        <w:pStyle w:val="Nagwek2"/>
+      </w:pPr>
+      <w:bookmarkStart w:id="7" w:name="_Toc236600326"/>
+      <w:r>
+        <w:t>PRIORYTET 2 — Mechaniki charakterystyczne dla gry</w:t>
+      </w:r>
+      <w:bookmarkEnd w:id="7"/>
+    </w:p>
+    <w:p>
+      <w:r>
+        <w:t>Tutaj zaczyna się właściwa „gra”.</w:t>
+      </w:r>
+    </w:p>
+    <w:tbl>
+      <w:tblPr>
+        <w:tblW w:w="0" w:type="auto"/>
+        <w:tblCellSpacing w:w="15" w:type="dxa"/>
+        <w:tblBorders>
+          <w:top w:val="single" w:sz="4" w:space="0" w:color="auto"/>
+          <w:left w:val="single" w:sz="4" w:space="0" w:color="auto"/>
+          <w:bottom w:val="single" w:sz="4" w:space="0" w:color="auto"/>
+          <w:right w:val="single" w:sz="4" w:space="0" w:color="auto"/>
+          <w:insideH w:val="single" w:sz="4" w:space="0" w:color="auto"/>
+          <w:insideV w:val="single" w:sz="4" w:space="0" w:color="auto"/>
+        </w:tblBorders>
+        <w:tblCellMar>
+          <w:top w:w="15" w:type="dxa"/>
+          <w:left w:w="15" w:type="dxa"/>
+          <w:bottom w:w="15" w:type="dxa"/>
+          <w:right w:w="15" w:type="dxa"/>
+        </w:tblCellMar>
+        <w:tblLook w:val="04A0" w:firstRow="1" w:lastRow="0" w:firstColumn="1" w:lastColumn="0" w:noHBand="0" w:noVBand="1"/>
+      </w:tblPr>
+      <w:tblGrid>
+        <w:gridCol w:w="2500"/>
+        <w:gridCol w:w="1031"/>
+        <w:gridCol w:w="5013"/>
+      </w:tblGrid>
+      <w:tr>
+        <w:trPr>
+          <w:tblHeader/>
+          <w:tblCellSpacing w:w="15" w:type="dxa"/>
+        </w:trPr>
+        <w:tc>
+          <w:tcPr>
+            <w:tcW w:w="0" w:type="auto"/>
+            <w:vAlign w:val="center"/>
+            <w:hideMark/>
+          </w:tcPr>
+          <w:p>
+            <w:pPr>
+              <w:rPr>
+                <w:b/>
+                <w:bCs/>
+              </w:rPr>
+            </w:pPr>
+            <w:r>
+              <w:rPr>
+                <w:b/>
+                <w:bCs/>
+              </w:rPr>
+              <w:lastRenderedPageBreak/>
+              <w:t>Element</w:t>
+            </w:r>
+          </w:p>
+        </w:tc>
+        <w:tc>
+          <w:tcPr>
+            <w:tcW w:w="0" w:type="auto"/>
+            <w:vAlign w:val="center"/>
+            <w:hideMark/>
+          </w:tcPr>
+          <w:p>
+            <w:pPr>
+              <w:rPr>
+                <w:b/>
+                <w:bCs/>
+              </w:rPr>
+            </w:pPr>
+            <w:r>
+              <w:rPr>
+                <w:b/>
+                <w:bCs/>
+              </w:rPr>
+              <w:t>Priorytet</w:t>
+            </w:r>
+          </w:p>
+        </w:tc>
+        <w:tc>
+          <w:tcPr>
+            <w:tcW w:w="0" w:type="auto"/>
+            <w:vAlign w:val="center"/>
+            <w:hideMark/>
+          </w:tcPr>
+          <w:p>
+            <w:pPr>
+              <w:rPr>
+                <w:b/>
+                <w:bCs/>
+              </w:rPr>
+            </w:pPr>
+            <w:r>
+              <w:rPr>
+                <w:b/>
+                <w:bCs/>
+              </w:rPr>
+              <w:t>Uzasadnienie</w:t>
+            </w:r>
+          </w:p>
+        </w:tc>
+      </w:tr>
+      <w:tr>
+        <w:trPr>
+          <w:tblCellSpacing w:w="15" w:type="dxa"/>
+        </w:trPr>
+        <w:tc>
+          <w:tcPr>
+            <w:tcW w:w="0" w:type="auto"/>
+            <w:vAlign w:val="center"/>
+            <w:hideMark/>
+          </w:tcPr>
+          <w:p>
+            <w:r>
+              <w:rPr>
+                <w:b/>
+                <w:bCs/>
+              </w:rPr>
+              <w:t>HID (mysz/klawiatura)</w:t>
+            </w:r>
+          </w:p>
+        </w:tc>
+        <w:tc>
+          <w:tcPr>
+            <w:tcW w:w="0" w:type="auto"/>
+            <w:vAlign w:val="center"/>
+            <w:hideMark/>
+          </w:tcPr>
+          <w:p>
+            <w:pPr>
+              <w:jc w:val="center"/>
+            </w:pPr>
+            <w:r>
+              <w:rPr>
+                <w:rFonts w:ascii="Segoe UI Emoji" w:hAnsi="Segoe UI Emoji" w:cs="Segoe UI Emoji"/>
+              </w:rPr>
+              <w:t>5</w:t>
+            </w:r>
+          </w:p>
+        </w:tc>
+        <w:tc>
+          <w:tcPr>
+            <w:tcW w:w="0" w:type="auto"/>
+            <w:vAlign w:val="center"/>
+            <w:hideMark/>
+          </w:tcPr>
+          <w:p>
+            <w:r>
+              <w:t>Niezbędne sterowanie.</w:t>
+            </w:r>
+          </w:p>
+        </w:tc>
+      </w:tr>
+      <w:tr>
+        <w:trPr>
+          <w:tblCellSpacing w:w="15" w:type="dxa"/>
+        </w:trPr>
+        <w:tc>
+          <w:tcPr>
+            <w:tcW w:w="0" w:type="auto"/>
+            <w:vAlign w:val="center"/>
+            <w:hideMark/>
+          </w:tcPr>
+          <w:p>
+            <w:r>
+              <w:rPr>
+                <w:b/>
+                <w:bCs/>
+              </w:rPr>
+              <w:t>Kolizje</w:t>
+            </w:r>
+          </w:p>
+        </w:tc>
+        <w:tc>
+          <w:tcPr>
+            <w:tcW w:w="0" w:type="auto"/>
+            <w:vAlign w:val="center"/>
+            <w:hideMark/>
+          </w:tcPr>
+          <w:p>
+            <w:pPr>
+              <w:jc w:val="center"/>
+            </w:pPr>
+            <w:r>
+              <w:rPr>
+                <w:rFonts w:ascii="Segoe UI Emoji" w:hAnsi="Segoe UI Emoji" w:cs="Segoe UI Emoji"/>
+              </w:rPr>
+              <w:t>5</w:t>
+            </w:r>
+          </w:p>
+        </w:tc>
+        <w:tc>
+          <w:tcPr>
+            <w:tcW w:w="0" w:type="auto"/>
+            <w:vAlign w:val="center"/>
+            <w:hideMark/>
+          </w:tcPr>
+          <w:p>
+            <w:r>
+              <w:t>Wymagane dla ruchu i walki.</w:t>
+            </w:r>
+          </w:p>
+        </w:tc>
+      </w:tr>
+      <w:tr>
+        <w:trPr>
+          <w:tblCellSpacing w:w="15" w:type="dxa"/>
+        </w:trPr>
+        <w:tc>
+          <w:tcPr>
+            <w:tcW w:w="0" w:type="auto"/>
+            <w:vAlign w:val="center"/>
+            <w:hideMark/>
+          </w:tcPr>
+          <w:p>
+            <w:r>
+              <w:rPr>
+                <w:b/>
+                <w:bCs/>
+              </w:rPr>
+              <w:t>FSM AI</w:t>
+            </w:r>
+          </w:p>
+        </w:tc>
+        <w:tc>
+          <w:tcPr>
+            <w:tcW w:w="0" w:type="auto"/>
+            <w:vAlign w:val="center"/>
+            <w:hideMark/>
+          </w:tcPr>
+          <w:p>
+            <w:pPr>
+              <w:jc w:val="center"/>
+            </w:pPr>
+            <w:r>
+              <w:rPr>
+                <w:rFonts w:ascii="Segoe UI Emoji" w:hAnsi="Segoe UI Emoji" w:cs="Segoe UI Emoji"/>
+              </w:rPr>
+              <w:t>5</w:t>
+            </w:r>
+          </w:p>
+        </w:tc>
+        <w:tc>
+          <w:tcPr>
+            <w:tcW w:w="0" w:type="auto"/>
+            <w:vAlign w:val="center"/>
+            <w:hideMark/>
+          </w:tcPr>
+          <w:p>
+            <w:r>
+              <w:t>Sterowanie zachowaniem przeciwników.</w:t>
+            </w:r>
+          </w:p>
+        </w:tc>
+      </w:tr>
+      <w:tr>
+        <w:trPr>
+          <w:tblCellSpacing w:w="15" w:type="dxa"/>
+        </w:trPr>
+        <w:tc>
+          <w:tcPr>
+            <w:tcW w:w="0" w:type="auto"/>
+            <w:vAlign w:val="center"/>
+            <w:hideMark/>
+          </w:tcPr>
+          <w:p>
+            <w:r>
+              <w:rPr>
+                <w:b/>
+                <w:bCs/>
+              </w:rPr>
+              <w:t>Pathfinding</w:t>
+            </w:r>
+          </w:p>
+        </w:tc>
+        <w:tc>
+          <w:tcPr>
+            <w:tcW w:w="0" w:type="auto"/>
+            <w:vAlign w:val="center"/>
+            <w:hideMark/>
+          </w:tcPr>
+          <w:p>
+            <w:pPr>
+              <w:jc w:val="center"/>
+            </w:pPr>
+            <w:r>
+              <w:rPr>
+                <w:rFonts w:ascii="Segoe UI Emoji" w:hAnsi="Segoe UI Emoji" w:cs="Segoe UI Emoji"/>
+              </w:rPr>
+              <w:t>4</w:t>
+            </w:r>
+          </w:p>
+        </w:tc>
+        <w:tc>
+          <w:tcPr>
+            <w:tcW w:w="0" w:type="auto"/>
+            <w:vAlign w:val="center"/>
+            <w:hideMark/>
+          </w:tcPr>
+          <w:p>
+            <w:r>
+              <w:t>Bardzo ważny dla gry izometrycznej typu Diablo.</w:t>
+            </w:r>
+          </w:p>
+        </w:tc>
+      </w:tr>
+    </w:tbl>
+    <w:p/>
+    <w:p>
+      <w:pPr>
+        <w:pStyle w:val="Nagwek2"/>
+      </w:pPr>
+      <w:bookmarkStart w:id="8" w:name="_Toc236600327"/>
+      <w:r>
+        <w:t>PRIORYTET 3 — Rozbudowa i optymalizacja</w:t>
+      </w:r>
+      <w:bookmarkEnd w:id="8"/>
+    </w:p>
+    <w:p>
+      <w:r>
+        <w:t>Elementy, które warto zrobić, ale dopiero kiedy fundament działa.</w:t>
+      </w:r>
+    </w:p>
+    <w:tbl>
+      <w:tblPr>
+        <w:tblW w:w="0" w:type="auto"/>
+        <w:tblCellSpacing w:w="15" w:type="dxa"/>
+        <w:tblBorders>
+          <w:top w:val="single" w:sz="4" w:space="0" w:color="auto"/>
+          <w:left w:val="single" w:sz="4" w:space="0" w:color="auto"/>
+          <w:bottom w:val="single" w:sz="4" w:space="0" w:color="auto"/>
+          <w:right w:val="single" w:sz="4" w:space="0" w:color="auto"/>
+          <w:insideH w:val="single" w:sz="4" w:space="0" w:color="auto"/>
+          <w:insideV w:val="single" w:sz="4" w:space="0" w:color="auto"/>
+        </w:tblBorders>
+        <w:tblCellMar>
+          <w:top w:w="15" w:type="dxa"/>
+          <w:left w:w="15" w:type="dxa"/>
+          <w:bottom w:w="15" w:type="dxa"/>
+          <w:right w:w="15" w:type="dxa"/>
+        </w:tblCellMar>
+        <w:tblLook w:val="04A0" w:firstRow="1" w:lastRow="0" w:firstColumn="1" w:lastColumn="0" w:noHBand="0" w:noVBand="1"/>
+      </w:tblPr>
+      <w:tblGrid>
+        <w:gridCol w:w="2759"/>
+        <w:gridCol w:w="1031"/>
+        <w:gridCol w:w="5272"/>
+      </w:tblGrid>
+      <w:tr>
+        <w:trPr>
+          <w:tblHeader/>
+          <w:tblCellSpacing w:w="15" w:type="dxa"/>
+        </w:trPr>
+        <w:tc>
+          <w:tcPr>
+            <w:tcW w:w="0" w:type="auto"/>
+            <w:vAlign w:val="center"/>
+            <w:hideMark/>
+          </w:tcPr>
+          <w:p>
+            <w:pPr>
+              <w:rPr>
+                <w:b/>
+                <w:bCs/>
+              </w:rPr>
+            </w:pPr>
+            <w:r>
+              <w:rPr>
+                <w:b/>
+                <w:bCs/>
+              </w:rPr>
+              <w:t>Element</w:t>
+            </w:r>
+          </w:p>
+        </w:tc>
+        <w:tc>
+          <w:tcPr>
+            <w:tcW w:w="0" w:type="auto"/>
+            <w:vAlign w:val="center"/>
+            <w:hideMark/>
+          </w:tcPr>
+          <w:p>
+            <w:pPr>
+              <w:rPr>
+                <w:b/>
+                <w:bCs/>
+              </w:rPr>
+            </w:pPr>
+            <w:r>
+              <w:rPr>
+                <w:b/>
+                <w:bCs/>
+              </w:rPr>
+              <w:t>Priorytet</w:t>
+            </w:r>
+          </w:p>
+        </w:tc>
+        <w:tc>
+          <w:tcPr>
+            <w:tcW w:w="0" w:type="auto"/>
+            <w:vAlign w:val="center"/>
+            <w:hideMark/>
+          </w:tcPr>
+          <w:p>
+            <w:pPr>
+              <w:rPr>
+                <w:b/>
+                <w:bCs/>
+              </w:rPr>
+            </w:pPr>
+            <w:r>
+              <w:rPr>
+                <w:b/>
+                <w:bCs/>
+              </w:rPr>
+              <w:t>Uzasadnienie</w:t>
+            </w:r>
+          </w:p>
+        </w:tc>
+      </w:tr>
+      <w:tr>
+        <w:trPr>
+          <w:tblCellSpacing w:w="15" w:type="dxa"/>
+        </w:trPr>
+        <w:tc>
+          <w:tcPr>
+            <w:tcW w:w="0" w:type="auto"/>
+            <w:vAlign w:val="center"/>
+            <w:hideMark/>
+          </w:tcPr>
+          <w:p>
+            <w:r>
+              <w:rPr>
+                <w:b/>
+                <w:bCs/>
+              </w:rPr>
+              <w:t>Oświetlenie / Deferred Shading</w:t>
+            </w:r>
+          </w:p>
+        </w:tc>
+        <w:tc>
+          <w:tcPr>
+            <w:tcW w:w="0" w:type="auto"/>
+            <w:vAlign w:val="center"/>
+            <w:hideMark/>
+          </w:tcPr>
+          <w:p>
+            <w:pPr>
+              <w:jc w:val="center"/>
+            </w:pPr>
+            <w:r>
+              <w:rPr>
+                <w:rFonts w:ascii="Segoe UI Emoji" w:hAnsi="Segoe UI Emoji" w:cs="Segoe UI Emoji"/>
+              </w:rPr>
+              <w:t>4</w:t>
+            </w:r>
+          </w:p>
+        </w:tc>
+        <w:tc>
+          <w:tcPr>
+            <w:tcW w:w="0" w:type="auto"/>
+            <w:vAlign w:val="center"/>
+            <w:hideMark/>
+          </w:tcPr>
+          <w:p>
+            <w:r>
+              <w:t>Duża wartość wizualna, ale można zacząć od prostszego rozwiązania.</w:t>
+            </w:r>
+          </w:p>
+        </w:tc>
+      </w:tr>
+      <w:tr>
+        <w:trPr>
+          <w:tblCellSpacing w:w="15" w:type="dxa"/>
+        </w:trPr>
+        <w:tc>
+          <w:tcPr>
+            <w:tcW w:w="0" w:type="auto"/>
+            <w:vAlign w:val="center"/>
+            <w:hideMark/>
+          </w:tcPr>
+          <w:p>
+            <w:r>
+              <w:rPr>
+                <w:b/>
+                <w:bCs/>
+              </w:rPr>
+              <w:t>Particle System</w:t>
+            </w:r>
+          </w:p>
+        </w:tc>
+        <w:tc>
+          <w:tcPr>
+            <w:tcW w:w="0" w:type="auto"/>
+            <w:vAlign w:val="center"/>
+            <w:hideMark/>
+          </w:tcPr>
+          <w:p>
+            <w:pPr>
+              <w:jc w:val="center"/>
+            </w:pPr>
+            <w:r>
+              <w:rPr>
+                <w:rFonts w:ascii="Segoe UI Emoji" w:hAnsi="Segoe UI Emoji" w:cs="Segoe UI Emoji"/>
+              </w:rPr>
+              <w:t>3</w:t>
+            </w:r>
+          </w:p>
+        </w:tc>
+        <w:tc>
+          <w:tcPr>
+            <w:tcW w:w="0" w:type="auto"/>
+            <w:vAlign w:val="center"/>
+            <w:hideMark/>
+          </w:tcPr>
+          <w:p>
+            <w:r>
+              <w:t>Efekty specjalne.</w:t>
+            </w:r>
+          </w:p>
+        </w:tc>
+      </w:tr>
+      <w:tr>
+        <w:trPr>
+          <w:tblCellSpacing w:w="15" w:type="dxa"/>
+        </w:trPr>
+        <w:tc>
+          <w:tcPr>
+            <w:tcW w:w="0" w:type="auto"/>
+            <w:vAlign w:val="center"/>
+            <w:hideMark/>
+          </w:tcPr>
+          <w:p>
+            <w:r>
+              <w:rPr>
+                <w:b/>
+                <w:bCs/>
+              </w:rPr>
+              <w:t>Audio 3D</w:t>
+            </w:r>
+          </w:p>
+        </w:tc>
+        <w:tc>
+          <w:tcPr>
+            <w:tcW w:w="0" w:type="auto"/>
+            <w:vAlign w:val="center"/>
+            <w:hideMark/>
+          </w:tcPr>
+          <w:p>
+            <w:pPr>
+              <w:jc w:val="center"/>
+            </w:pPr>
+            <w:r>
+              <w:rPr>
+                <w:rFonts w:ascii="Segoe UI Emoji" w:hAnsi="Segoe UI Emoji" w:cs="Segoe UI Emoji"/>
+              </w:rPr>
+              <w:t>2</w:t>
+            </w:r>
+          </w:p>
+        </w:tc>
+        <w:tc>
+          <w:tcPr>
+            <w:tcW w:w="0" w:type="auto"/>
+            <w:vAlign w:val="center"/>
+            <w:hideMark/>
+          </w:tcPr>
+          <w:p>
+            <w:r>
+              <w:t>Klimat i immersja.</w:t>
+            </w:r>
+          </w:p>
+        </w:tc>
+      </w:tr>
+      <w:tr>
+        <w:trPr>
+          <w:tblCellSpacing w:w="15" w:type="dxa"/>
+        </w:trPr>
+        <w:tc>
+          <w:tcPr>
+            <w:tcW w:w="0" w:type="auto"/>
+            <w:vAlign w:val="center"/>
+            <w:hideMark/>
+          </w:tcPr>
+          <w:p>
+            <w:r>
+              <w:rPr>
+                <w:b/>
+                <w:bCs/>
+              </w:rPr>
+              <w:t>Instanced Rendering</w:t>
+            </w:r>
+          </w:p>
+        </w:tc>
+        <w:tc>
+          <w:tcPr>
+            <w:tcW w:w="0" w:type="auto"/>
+            <w:vAlign w:val="center"/>
+            <w:hideMark/>
+          </w:tcPr>
+          <w:p>
+            <w:pPr>
+              <w:jc w:val="center"/>
+            </w:pPr>
+            <w:r>
+              <w:rPr>
+                <w:rFonts w:ascii="Segoe UI Emoji" w:hAnsi="Segoe UI Emoji" w:cs="Segoe UI Emoji"/>
+              </w:rPr>
+              <w:t>3</w:t>
+            </w:r>
+          </w:p>
+        </w:tc>
+        <w:tc>
+          <w:tcPr>
+            <w:tcW w:w="0" w:type="auto"/>
+            <w:vAlign w:val="center"/>
+            <w:hideMark/>
+          </w:tcPr>
+          <w:p>
+            <w:r>
+              <w:t>Optymalizacja przy dużej liczbie obiektów.</w:t>
+            </w:r>
+          </w:p>
+        </w:tc>
+      </w:tr>
+    </w:tbl>
+    <w:p/>
+    <w:p>
+      <w:pPr>
+        <w:pStyle w:val="Nagwek2"/>
+      </w:pPr>
+      <w:bookmarkStart w:id="9" w:name="_Toc236600328"/>
+      <w:r>
+        <w:t>PRIORYTET 4 — Narzędzia / edytor</w:t>
+      </w:r>
+      <w:bookmarkEnd w:id="9"/>
+    </w:p>
+    <w:p>
+      <w:r>
+        <w:t>Przydatne, ale nie dla samego silnika.</w:t>
+      </w:r>
+    </w:p>
+    <w:tbl>
+      <w:tblPr>
+        <w:tblW w:w="0" w:type="auto"/>
+        <w:tblCellSpacing w:w="15" w:type="dxa"/>
+        <w:tblBorders>
+          <w:top w:val="single" w:sz="4" w:space="0" w:color="auto"/>
+          <w:left w:val="single" w:sz="4" w:space="0" w:color="auto"/>
+          <w:bottom w:val="single" w:sz="4" w:space="0" w:color="auto"/>
+          <w:right w:val="single" w:sz="4" w:space="0" w:color="auto"/>
+          <w:insideH w:val="single" w:sz="4" w:space="0" w:color="auto"/>
+          <w:insideV w:val="single" w:sz="4" w:space="0" w:color="auto"/>
+        </w:tblBorders>
+        <w:tblCellMar>
+          <w:top w:w="15" w:type="dxa"/>
+          <w:left w:w="15" w:type="dxa"/>
+          <w:bottom w:w="15" w:type="dxa"/>
+          <w:right w:w="15" w:type="dxa"/>
+        </w:tblCellMar>
+        <w:tblLook w:val="04A0" w:firstRow="1" w:lastRow="0" w:firstColumn="1" w:lastColumn="0" w:noHBand="0" w:noVBand="1"/>
+      </w:tblPr>
+      <w:tblGrid>
+        <w:gridCol w:w="2763"/>
+        <w:gridCol w:w="1031"/>
+        <w:gridCol w:w="5268"/>
+      </w:tblGrid>
+      <w:tr>
+        <w:trPr>
+          <w:tblHeader/>
+          <w:tblCellSpacing w:w="15" w:type="dxa"/>
+        </w:trPr>
+        <w:tc>
+          <w:tcPr>
+            <w:tcW w:w="0" w:type="auto"/>
+            <w:vAlign w:val="center"/>
+            <w:hideMark/>
+          </w:tcPr>
+          <w:p>
+            <w:pPr>
+              <w:rPr>
+                <w:b/>
+                <w:bCs/>
+              </w:rPr>
+            </w:pPr>
+            <w:r>
+              <w:rPr>
+                <w:b/>
+                <w:bCs/>
+              </w:rPr>
+              <w:t>Element</w:t>
+            </w:r>
+          </w:p>
+        </w:tc>
+        <w:tc>
+          <w:tcPr>
+            <w:tcW w:w="0" w:type="auto"/>
+            <w:vAlign w:val="center"/>
+            <w:hideMark/>
+          </w:tcPr>
+          <w:p>
+            <w:pPr>
+              <w:rPr>
+                <w:b/>
+                <w:bCs/>
+              </w:rPr>
+            </w:pPr>
+            <w:r>
+              <w:rPr>
+                <w:b/>
+                <w:bCs/>
+              </w:rPr>
+              <w:t>Priorytet</w:t>
+            </w:r>
+          </w:p>
+        </w:tc>
+        <w:tc>
+          <w:tcPr>
+            <w:tcW w:w="0" w:type="auto"/>
+            <w:vAlign w:val="center"/>
+            <w:hideMark/>
+          </w:tcPr>
+          <w:p>
+            <w:pPr>
+              <w:rPr>
+                <w:b/>
+                <w:bCs/>
+              </w:rPr>
+            </w:pPr>
+            <w:r>
+              <w:rPr>
+                <w:b/>
+                <w:bCs/>
+              </w:rPr>
+              <w:t>Uzasadnienie</w:t>
+            </w:r>
+          </w:p>
+        </w:tc>
+      </w:tr>
+      <w:tr>
+        <w:trPr>
+          <w:tblCellSpacing w:w="15" w:type="dxa"/>
+        </w:trPr>
+        <w:tc>
+          <w:tcPr>
+            <w:tcW w:w="0" w:type="auto"/>
+            <w:vAlign w:val="center"/>
+            <w:hideMark/>
+          </w:tcPr>
+          <w:p>
+            <w:r>
+              <w:rPr>
+                <w:b/>
+                <w:bCs/>
+              </w:rPr>
+              <w:t>Podgląd modeli 3D / Edytor</w:t>
+            </w:r>
+          </w:p>
+        </w:tc>
+        <w:tc>
+          <w:tcPr>
+            <w:tcW w:w="0" w:type="auto"/>
+            <w:vAlign w:val="center"/>
+            <w:hideMark/>
+          </w:tcPr>
+          <w:p>
+            <w:pPr>
+              <w:jc w:val="center"/>
+            </w:pPr>
+            <w:r>
+              <w:rPr>
+                <w:rFonts w:ascii="Segoe UI Emoji" w:hAnsi="Segoe UI Emoji" w:cs="Segoe UI Emoji"/>
+              </w:rPr>
+              <w:t>2</w:t>
+            </w:r>
+          </w:p>
+        </w:tc>
+        <w:tc>
+          <w:tcPr>
+            <w:tcW w:w="0" w:type="auto"/>
+            <w:vAlign w:val="center"/>
+            <w:hideMark/>
+          </w:tcPr>
+          <w:p>
+            <w:r>
+              <w:t>Przydatne narzędzie, ale nie wpływa na działanie silnika.</w:t>
+            </w:r>
+          </w:p>
+        </w:tc>
+      </w:tr>
+    </w:tbl>
+    <w:p/>
+    <w:p/>
+    <w:p>
+      <w:pPr>
+        <w:pStyle w:val="Nagwek2"/>
+      </w:pPr>
+      <w:bookmarkStart w:id="10" w:name="_Toc236600329"/>
+      <w:r>
+        <w:lastRenderedPageBreak/>
+        <w:t>Sugerowana kolejność poszczególnych działań</w:t>
+      </w:r>
+      <w:bookmarkEnd w:id="10"/>
+    </w:p>
+    <w:tbl>
+      <w:tblPr>
+        <w:tblW w:w="0" w:type="auto"/>
+        <w:tblCellSpacing w:w="15" w:type="dxa"/>
+        <w:tblBorders>
+          <w:top w:val="single" w:sz="4" w:space="0" w:color="auto"/>
+          <w:left w:val="single" w:sz="4" w:space="0" w:color="auto"/>
+          <w:bottom w:val="single" w:sz="4" w:space="0" w:color="auto"/>
+          <w:right w:val="single" w:sz="4" w:space="0" w:color="auto"/>
+          <w:insideH w:val="single" w:sz="4" w:space="0" w:color="auto"/>
+          <w:insideV w:val="single" w:sz="4" w:space="0" w:color="auto"/>
+        </w:tblBorders>
+        <w:tblCellMar>
+          <w:top w:w="15" w:type="dxa"/>
+          <w:left w:w="15" w:type="dxa"/>
+          <w:bottom w:w="15" w:type="dxa"/>
+          <w:right w:w="15" w:type="dxa"/>
+        </w:tblCellMar>
+        <w:tblLook w:val="04A0" w:firstRow="1" w:lastRow="0" w:firstColumn="1" w:lastColumn="0" w:noHBand="0" w:noVBand="1"/>
+      </w:tblPr>
+      <w:tblGrid>
+        <w:gridCol w:w="1643"/>
+        <w:gridCol w:w="1273"/>
+        <w:gridCol w:w="1693"/>
+        <w:gridCol w:w="2025"/>
+        <w:gridCol w:w="1099"/>
+        <w:gridCol w:w="1329"/>
+      </w:tblGrid>
+      <w:tr>
+        <w:trPr>
+          <w:tblHeader/>
+          <w:tblCellSpacing w:w="15" w:type="dxa"/>
+        </w:trPr>
+        <w:tc>
+          <w:tcPr>
+            <w:tcW w:w="0" w:type="auto"/>
+            <w:vAlign w:val="center"/>
+            <w:hideMark/>
+          </w:tcPr>
+          <w:p>
+            <w:pPr>
+              <w:rPr>
+                <w:b/>
+                <w:bCs/>
+              </w:rPr>
+            </w:pPr>
+            <w:r>
+              <w:rPr>
+                <w:b/>
+                <w:bCs/>
+              </w:rPr>
+              <w:t>Etap 1</w:t>
+            </w:r>
+          </w:p>
+        </w:tc>
+        <w:tc>
+          <w:tcPr>
+            <w:tcW w:w="0" w:type="auto"/>
+            <w:vAlign w:val="center"/>
+            <w:hideMark/>
+          </w:tcPr>
+          <w:p>
+            <w:pPr>
+              <w:rPr>
+                <w:b/>
+                <w:bCs/>
+              </w:rPr>
+            </w:pPr>
+            <w:r>
+              <w:rPr>
+                <w:b/>
+                <w:bCs/>
+              </w:rPr>
+              <w:t>Etap 2</w:t>
+            </w:r>
+          </w:p>
+        </w:tc>
+        <w:tc>
+          <w:tcPr>
+            <w:tcW w:w="0" w:type="auto"/>
+            <w:vAlign w:val="center"/>
+            <w:hideMark/>
+          </w:tcPr>
+          <w:p>
+            <w:pPr>
+              <w:rPr>
+                <w:b/>
+                <w:bCs/>
+              </w:rPr>
+            </w:pPr>
+            <w:r>
+              <w:rPr>
+                <w:b/>
+                <w:bCs/>
+              </w:rPr>
+              <w:t>Etap 3</w:t>
+            </w:r>
+          </w:p>
+        </w:tc>
+        <w:tc>
+          <w:tcPr>
+            <w:tcW w:w="0" w:type="auto"/>
+            <w:vAlign w:val="center"/>
+            <w:hideMark/>
+          </w:tcPr>
+          <w:p>
+            <w:pPr>
+              <w:rPr>
+                <w:b/>
+                <w:bCs/>
+              </w:rPr>
+            </w:pPr>
+            <w:r>
+              <w:rPr>
+                <w:b/>
+                <w:bCs/>
+              </w:rPr>
+              <w:t>Etap 4</w:t>
+            </w:r>
+          </w:p>
+        </w:tc>
+        <w:tc>
+          <w:tcPr>
+            <w:tcW w:w="0" w:type="auto"/>
+            <w:vAlign w:val="center"/>
+            <w:hideMark/>
+          </w:tcPr>
+          <w:p>
+            <w:pPr>
+              <w:rPr>
+                <w:b/>
+                <w:bCs/>
+              </w:rPr>
+            </w:pPr>
+            <w:r>
+              <w:rPr>
+                <w:b/>
+                <w:bCs/>
+              </w:rPr>
+              <w:t>Etap 5</w:t>
+            </w:r>
+          </w:p>
+        </w:tc>
+        <w:tc>
+          <w:tcPr>
+            <w:tcW w:w="0" w:type="auto"/>
+            <w:vAlign w:val="center"/>
+            <w:hideMark/>
+          </w:tcPr>
+          <w:p>
+            <w:pPr>
+              <w:rPr>
+                <w:b/>
+                <w:bCs/>
+              </w:rPr>
+            </w:pPr>
+            <w:r>
+              <w:rPr>
+                <w:b/>
+                <w:bCs/>
+              </w:rPr>
+              <w:t>Etap 6</w:t>
+            </w:r>
+          </w:p>
+        </w:tc>
+      </w:tr>
+      <w:tr>
+        <w:trPr>
+          <w:tblCellSpacing w:w="15" w:type="dxa"/>
+        </w:trPr>
+        <w:tc>
+          <w:tcPr>
+            <w:tcW w:w="0" w:type="auto"/>
+            <w:vAlign w:val="center"/>
+            <w:hideMark/>
+          </w:tcPr>
+          <w:p>
+            <w:r>
+              <w:t>Kamera + Izometria</w:t>
+            </w:r>
+          </w:p>
+        </w:tc>
+        <w:tc>
+          <w:tcPr>
+            <w:tcW w:w="0" w:type="auto"/>
+            <w:vAlign w:val="center"/>
+            <w:hideMark/>
+          </w:tcPr>
+          <w:p>
+            <w:r>
+              <w:t>ECS</w:t>
+            </w:r>
+          </w:p>
+        </w:tc>
+        <w:tc>
+          <w:tcPr>
+            <w:tcW w:w="0" w:type="auto"/>
+            <w:vAlign w:val="center"/>
+            <w:hideMark/>
+          </w:tcPr>
+          <w:p>
+            <w:r>
+              <w:t>Asset Manager</w:t>
+            </w:r>
+          </w:p>
+        </w:tc>
+        <w:tc>
+          <w:tcPr>
+            <w:tcW w:w="0" w:type="auto"/>
+            <w:vAlign w:val="center"/>
+            <w:hideMark/>
+          </w:tcPr>
+          <w:p>
+            <w:r>
+              <w:t>Render ECS</w:t>
+            </w:r>
+          </w:p>
+        </w:tc>
+        <w:tc>
+          <w:tcPr>
+            <w:tcW w:w="0" w:type="auto"/>
+            <w:vAlign w:val="center"/>
+            <w:hideMark/>
+          </w:tcPr>
+          <w:p>
+            <w:r>
+              <w:t>HID</w:t>
+            </w:r>
+          </w:p>
+        </w:tc>
+        <w:tc>
+          <w:tcPr>
+            <w:tcW w:w="0" w:type="auto"/>
+            <w:vAlign w:val="center"/>
+            <w:hideMark/>
+          </w:tcPr>
+          <w:p>
+            <w:r>
+              <w:t>Event Queue</w:t>
+            </w:r>
+          </w:p>
+        </w:tc>
+      </w:tr>
+      <w:tr>
+        <w:trPr>
+          <w:tblCellSpacing w:w="15" w:type="dxa"/>
+        </w:trPr>
+        <w:tc>
+          <w:tcPr>
+            <w:tcW w:w="0" w:type="auto"/>
+            <w:vAlign w:val="center"/>
+            <w:hideMark/>
+          </w:tcPr>
+          <w:p>
+            <w:r>
+              <w:t>Command Buffer</w:t>
+            </w:r>
+          </w:p>
+        </w:tc>
+        <w:tc>
+          <w:tcPr>
+            <w:tcW w:w="0" w:type="auto"/>
+            <w:vAlign w:val="center"/>
+            <w:hideMark/>
+          </w:tcPr>
+          <w:p>
+            <w:r>
+              <w:t>Scene Manager</w:t>
+            </w:r>
+          </w:p>
+        </w:tc>
+        <w:tc>
+          <w:tcPr>
+            <w:tcW w:w="0" w:type="auto"/>
+            <w:vAlign w:val="center"/>
+            <w:hideMark/>
+          </w:tcPr>
+          <w:p>
+            <w:r>
+              <w:t>Data Driven JSON/XML</w:t>
+            </w:r>
+          </w:p>
+        </w:tc>
+        <w:tc>
+          <w:tcPr>
+            <w:tcW w:w="0" w:type="auto"/>
+            <w:vAlign w:val="center"/>
+            <w:hideMark/>
+          </w:tcPr>
+          <w:p>
+            <w:r>
+              <w:t>Kolizje</w:t>
+            </w:r>
+          </w:p>
+        </w:tc>
+        <w:tc>
+          <w:tcPr>
+            <w:tcW w:w="0" w:type="auto"/>
+            <w:vAlign w:val="center"/>
+            <w:hideMark/>
+          </w:tcPr>
+          <w:p>
+            <w:r>
+              <w:t>AI FSM</w:t>
+            </w:r>
+          </w:p>
+        </w:tc>
+        <w:tc>
+          <w:tcPr>
+            <w:tcW w:w="0" w:type="auto"/>
+            <w:vAlign w:val="center"/>
+            <w:hideMark/>
+          </w:tcPr>
+          <w:p>
+            <w:r>
+              <w:t>Pathfinding</w:t>
+            </w:r>
+          </w:p>
+        </w:tc>
+      </w:tr>
+      <w:tr>
+        <w:trPr>
+          <w:tblCellSpacing w:w="15" w:type="dxa"/>
+        </w:trPr>
+        <w:tc>
+          <w:tcPr>
+            <w:tcW w:w="0" w:type="auto"/>
+            <w:vAlign w:val="center"/>
+            <w:hideMark/>
+          </w:tcPr>
+          <w:p>
+            <w:r>
+              <w:t>Oświetlenie</w:t>
+            </w:r>
+          </w:p>
+        </w:tc>
+        <w:tc>
+          <w:tcPr>
+            <w:tcW w:w="0" w:type="auto"/>
+            <w:vAlign w:val="center"/>
+            <w:hideMark/>
+          </w:tcPr>
+          <w:p>
+            <w:r>
+              <w:t>Audio</w:t>
+            </w:r>
+          </w:p>
+        </w:tc>
+        <w:tc>
+          <w:tcPr>
+            <w:tcW w:w="0" w:type="auto"/>
+            <w:vAlign w:val="center"/>
+            <w:hideMark/>
+          </w:tcPr>
+          <w:p>
+            <w:r>
+              <w:t>Particle System</w:t>
+            </w:r>
+          </w:p>
+        </w:tc>
+        <w:tc>
+          <w:tcPr>
+            <w:tcW w:w="0" w:type="auto"/>
+            <w:vAlign w:val="center"/>
+            <w:hideMark/>
+          </w:tcPr>
+          <w:p>
+            <w:r>
+              <w:t>Optymalizacja VRAM/GC</w:t>
+            </w:r>
+          </w:p>
+        </w:tc>
+        <w:tc>
+          <w:tcPr>
+            <w:tcW w:w="0" w:type="auto"/>
+            <w:vAlign w:val="center"/>
+            <w:hideMark/>
+          </w:tcPr>
+          <w:p>
+            <w:r>
+              <w:t>Edytor modeli</w:t>
+            </w:r>
+          </w:p>
+        </w:tc>
+        <w:tc>
+          <w:tcPr>
+            <w:tcW w:w="0" w:type="auto"/>
+            <w:vAlign w:val="center"/>
+            <w:hideMark/>
+          </w:tcPr>
+          <w:p>
+            <w:r>
+              <w:t>—</w:t>
+            </w:r>
+          </w:p>
+        </w:tc>
+      </w:tr>
+    </w:tbl>
+    <w:p>
+      <w:pPr>
+        <w:rPr>
+          <w:lang w:val="en-GB"/>
+        </w:rPr>
+      </w:pPr>
+    </w:p>
+    <w:p>
+      <w:pPr>
+        <w:pStyle w:val="Nagwek1"/>
+        <w:jc w:val="center"/>
+        <w:rPr>
+          <w:b/>
+          <w:bCs/>
+        </w:rPr>
+      </w:pPr>
+      <w:bookmarkStart w:id="11" w:name="_Toc236600330"/>
+      <w:r>
+        <w:rPr>
+          <w:b/>
+          <w:bCs/>
+        </w:rPr>
+        <w:t>Elementy już zaimplementowane</w:t>
+      </w:r>
+      <w:bookmarkEnd w:id="11"/>
+    </w:p>
+    <w:p>
+      <w:pPr>
+        <w:pStyle w:val="Akapitzlist"/>
+        <w:numPr>
+          <w:ilvl w:val="0"/>
+          <w:numId w:val="2"/>
+        </w:numPr>
+      </w:pPr>
+      <w:r>
+        <w:t>Własny kontekst graficzny TGLContext</w:t>
+      </w:r>
+      <w:r>
+        <w:t>.</w:t>
+      </w:r>
+    </w:p>
+    <w:p>
+      <w:pPr>
+        <w:pStyle w:val="Akapitzlist"/>
+        <w:numPr>
+          <w:ilvl w:val="0"/>
+          <w:numId w:val="2"/>
+        </w:numPr>
+      </w:pPr>
+      <w:r>
+        <w:t>Parser modeli FBX</w:t>
+      </w:r>
+      <w:r>
+        <w:t>.</w:t>
+      </w:r>
+    </w:p>
+    <w:p>
+      <w:pPr>
+        <w:pStyle w:val="Akapitzlist"/>
+        <w:numPr>
+          <w:ilvl w:val="0"/>
+          <w:numId w:val="2"/>
+        </w:numPr>
+      </w:pPr>
+      <w:r>
+        <w:t>Rendering modeli 3D</w:t>
+      </w:r>
+      <w:r>
+        <w:t>.</w:t>
+      </w:r>
+    </w:p>
+    <w:p>
+      <w:pPr>
+        <w:pStyle w:val="Akapitzlist"/>
+        <w:numPr>
+          <w:ilvl w:val="0"/>
+          <w:numId w:val="2"/>
+        </w:numPr>
+      </w:pPr>
+      <w:r>
+        <w:t xml:space="preserve"> Podstawowe shadery</w:t>
+      </w:r>
+      <w:r>
+        <w:t>.</w:t>
+      </w:r>
+    </w:p>
+    <w:p>
+      <w:pPr>
+        <w:pStyle w:val="Akapitzlist"/>
+        <w:numPr>
+          <w:ilvl w:val="0"/>
+          <w:numId w:val="2"/>
+        </w:numPr>
+      </w:pPr>
+      <w:r>
+        <w:t>Transformacje obiekt</w:t>
+      </w:r>
+      <w:r>
+        <w:rPr>
+          <w:rFonts w:ascii="Aptos" w:hAnsi="Aptos" w:cs="Aptos"/>
+        </w:rPr>
+        <w:t>ó</w:t>
+      </w:r>
+      <w:r>
+        <w:t>w</w:t>
+      </w:r>
+      <w:r>
+        <w:t>.</w:t>
+      </w:r>
+    </w:p>
+    <w:p>
+      <w:pPr>
+        <w:pStyle w:val="Akapitzlist"/>
+        <w:numPr>
+          <w:ilvl w:val="0"/>
+          <w:numId w:val="2"/>
+        </w:numPr>
+      </w:pPr>
+      <w:r>
+        <w:t>Obs</w:t>
+      </w:r>
+      <w:r>
+        <w:rPr>
+          <w:rFonts w:ascii="Aptos" w:hAnsi="Aptos" w:cs="Aptos"/>
+        </w:rPr>
+        <w:t>ł</w:t>
+      </w:r>
+      <w:r>
+        <w:t>uga kwaternion</w:t>
+      </w:r>
+      <w:r>
+        <w:rPr>
+          <w:rFonts w:ascii="Aptos" w:hAnsi="Aptos" w:cs="Aptos"/>
+        </w:rPr>
+        <w:t>ó</w:t>
+      </w:r>
+      <w:r>
+        <w:t>w</w:t>
+      </w:r>
+      <w:r>
+        <w:t>.</w:t>
+      </w:r>
+    </w:p>
+    <w:p/>
+    <w:p/>
     <w:sectPr>
       <w:pgSz w:w="11906" w:h="16838"/>
       <w:pgMar w:top="1417" w:right="1417" w:bottom="1417" w:left="1417" w:header="708" w:footer="708" w:gutter="0"/>
@@ -1193,6 +3843,95 @@
 <file path=word/numbering.xml><?xml version="1.0" encoding="utf-8"?>
 <w:numbering xmlns:wpc="http://schemas.microsoft.com/office/word/2010/wordprocessingCanvas" xmlns:cx="http://schemas.microsoft.com/office/drawing/2014/chartex" xmlns:cx1="http://schemas.microsoft.com/office/drawing/2015/9/8/chartex" xmlns:cx2="http://schemas.microsoft.com/office/drawing/2015/10/21/chartex" xmlns:cx3="http://schemas.microsoft.com/office/drawing/2016/5/9/chartex" xmlns:cx4="http://schemas.microsoft.com/office/drawing/2016/5/10/chartex" xmlns:cx5="http://schemas.microsoft.com/office/drawing/2016/5/11/chartex" xmlns:cx6="http://schemas.microsoft.com/office/drawing/2016/5/12/chartex" xmlns:cx7="http://schemas.microsoft.com/office/drawing/2016/5/13/chartex" xmlns:cx8="http://schemas.microsoft.com/office/drawing/2016/5/14/chartex" xmlns:mc="http://schemas.openxmlformats.org/markup-compatibility/2006" xmlns:aink="http://schemas.microsoft.com/office/drawing/2016/ink" xmlns:am3d="http://schemas.microsoft.com/office/drawing/2017/model3d" xmlns:o="urn:schemas-microsoft-com:office:office" xmlns:oel="http://schemas.microsoft.com/office/2019/extlst" xmlns:r="http://schemas.openxmlformats.org/officeDocument/2006/relationships" xmlns:m="http://schemas.openxmlformats.org/officeDocument/2006/math" xmlns:v="urn:schemas-microsoft-com:vml" xmlns:wp14="http://schemas.microsoft.com/office/word/2010/wordprocessingDrawing" xmlns:wp="http://schemas.openxmlformats.org/drawingml/2006/wordprocessingDrawing" xmlns:w10="urn:schemas-microsoft-com:office:word" xmlns:w="http://schemas.openxmlformats.org/wordprocessingml/2006/main" xmlns:w14="http://schemas.microsoft.com/office/word/2010/wordml" xmlns:w15="http://schemas.microsoft.com/office/word/2012/wordml" xmlns:w16cei="http://schemas.microsoft.com/office/word/2026/wordml/cei" xmlns:w16cex="http://schemas.microsoft.com/office/word/2018/wordml/cex" xmlns:w16cid="http://schemas.microsoft.com/office/word/2016/wordml/cid" xmlns:w16="http://schemas.microsoft.com/office/word/2018/wordml" xmlns:w16du="http://schemas.microsoft.com/office/word/2023/wordml/word16du" xmlns:w16sdtdh="http://schemas.microsoft.com/office/word/2020/wordml/sdtdatahash" xmlns:w16sdtfl="http://schemas.microsoft.com/office/word/2024/wordml/sdtformatlock" xmlns:w16se="http://schemas.microsoft.com/office/word/2015/wordml/symex" xmlns:wpg="http://schemas.microsoft.com/office/word/2010/wordprocessingGroup" xmlns:wpi="http://schemas.microsoft.com/office/word/2010/wordprocessingInk" xmlns:wne="http://schemas.microsoft.com/office/word/2006/wordml" xmlns:wps="http://schemas.microsoft.com/office/word/2010/wordprocessingShape" mc:Ignorable="w14 w15 w16se w16cid w16 w16cex w16sdtdh w16sdtfl w16du wp14">
   <w:abstractNum w:abstractNumId="0" w15:restartNumberingAfterBreak="0">
+    <w:nsid w:val="4BBB0048"/>
+    <w:multiLevelType w:val="hybridMultilevel"/>
+    <w:tmpl w:val="8E281B58"/>
+    <w:lvl w:ilvl="0" w:tplc="B3B25A88">
+      <w:start w:val="1"/>
+      <w:numFmt w:val="decimal"/>
+      <w:lvlText w:val="%1."/>
+      <w:lvlJc w:val="left"/>
+      <w:pPr>
+        <w:ind w:left="720" w:hanging="360"/>
+      </w:pPr>
+      <w:rPr>
+        <w:rFonts w:ascii="Segoe UI Emoji" w:hAnsi="Segoe UI Emoji" w:cs="Segoe UI Emoji" w:hint="default"/>
+      </w:rPr>
+    </w:lvl>
+    <w:lvl w:ilvl="1" w:tplc="04150019" w:tentative="1">
+      <w:start w:val="1"/>
+      <w:numFmt w:val="lowerLetter"/>
+      <w:lvlText w:val="%2."/>
+      <w:lvlJc w:val="left"/>
+      <w:pPr>
+        <w:ind w:left="1440" w:hanging="360"/>
+      </w:pPr>
+    </w:lvl>
+    <w:lvl w:ilvl="2" w:tplc="0415001B" w:tentative="1">
+      <w:start w:val="1"/>
+      <w:numFmt w:val="lowerRoman"/>
+      <w:lvlText w:val="%3."/>
+      <w:lvlJc w:val="right"/>
+      <w:pPr>
+        <w:ind w:left="2160" w:hanging="180"/>
+      </w:pPr>
+    </w:lvl>
+    <w:lvl w:ilvl="3" w:tplc="0415000F" w:tentative="1">
+      <w:start w:val="1"/>
+      <w:numFmt w:val="decimal"/>
+      <w:lvlText w:val="%4."/>
+      <w:lvlJc w:val="left"/>
+      <w:pPr>
+        <w:ind w:left="2880" w:hanging="360"/>
+      </w:pPr>
+    </w:lvl>
+    <w:lvl w:ilvl="4" w:tplc="04150019" w:tentative="1">
+      <w:start w:val="1"/>
+      <w:numFmt w:val="lowerLetter"/>
+      <w:lvlText w:val="%5."/>
+      <w:lvlJc w:val="left"/>
+      <w:pPr>
+        <w:ind w:left="3600" w:hanging="360"/>
+      </w:pPr>
+    </w:lvl>
+    <w:lvl w:ilvl="5" w:tplc="0415001B" w:tentative="1">
+      <w:start w:val="1"/>
+      <w:numFmt w:val="lowerRoman"/>
+      <w:lvlText w:val="%6."/>
+      <w:lvlJc w:val="right"/>
+      <w:pPr>
+        <w:ind w:left="4320" w:hanging="180"/>
+      </w:pPr>
+    </w:lvl>
+    <w:lvl w:ilvl="6" w:tplc="0415000F" w:tentative="1">
+      <w:start w:val="1"/>
+      <w:numFmt w:val="decimal"/>
+      <w:lvlText w:val="%7."/>
+      <w:lvlJc w:val="left"/>
+      <w:pPr>
+        <w:ind w:left="5040" w:hanging="360"/>
+      </w:pPr>
+    </w:lvl>
+    <w:lvl w:ilvl="7" w:tplc="04150019" w:tentative="1">
+      <w:start w:val="1"/>
+      <w:numFmt w:val="lowerLetter"/>
+      <w:lvlText w:val="%8."/>
+      <w:lvlJc w:val="left"/>
+      <w:pPr>
+        <w:ind w:left="5760" w:hanging="360"/>
+      </w:pPr>
+    </w:lvl>
+    <w:lvl w:ilvl="8" w:tplc="0415001B" w:tentative="1">
+      <w:start w:val="1"/>
+      <w:numFmt w:val="lowerRoman"/>
+      <w:lvlText w:val="%9."/>
+      <w:lvlJc w:val="right"/>
+      <w:pPr>
+        <w:ind w:left="6480" w:hanging="180"/>
+      </w:pPr>
+    </w:lvl>
+  </w:abstractNum>
+  <w:abstractNum w:abstractNumId="1" w15:restartNumberingAfterBreak="0">
     <w:nsid w:val="70357702"/>
     <w:multiLevelType w:val="hybridMultilevel"/>
     <w:tmpl w:val="9ED4ABB8"/>
@@ -1306,6 +4045,9 @@
     </w:lvl>
   </w:abstractNum>
   <w:num w:numId="1" w16cid:durableId="122697987">
+    <w:abstractNumId w:val="1"/>
+  </w:num>
+  <w:num w:numId="2" w16cid:durableId="1569530800">
     <w:abstractNumId w:val="0"/>
   </w:num>
 </w:numbering>

</xml_diff>